<commit_message>
Make reference-list DOIs clickable hyperlinks
Converted all 78 https://doi.org/... DOIs in the reference list into
external Word hyperlinks (blue, underlined) with proper relationship
entries. Tables 1-11, figures, and all data remain unchanged.

Co-Authored-By: Claude Opus 4.8 <noreply@anthropic.com>
Claude-Session: https://claude.ai/code/session_011XCha2d8Ja9Hda8oR8Rr56
</commit_message>
<xml_diff>
--- a/manuscript_peer_reviewed.docx
+++ b/manuscript_peer_reviewed.docx
@@ -22683,8 +22683,8 @@
     <w:p>
       <w:pPr>
         <w:ind w:left="480" w:hanging="480"/>
+        <w:spacing w:after="80" w:line="276" w:lineRule="auto"/>
         <w:jc w:val="left"/>
-        <w:spacing w:after="80" w:line="276" w:lineRule="auto"/>
       </w:pPr>
       <w:r>
         <w:rPr>
@@ -22697,246 +22697,467 @@
     <w:p>
       <w:pPr>
         <w:ind w:left="480" w:hanging="480"/>
+        <w:spacing w:after="80" w:line="276" w:lineRule="auto"/>
         <w:jc w:val="left"/>
-        <w:spacing w:after="80" w:line="276" w:lineRule="auto"/>
       </w:pPr>
       <w:r>
         <w:rPr>
           <w:sz w:val="22"/>
           <w:szCs w:val="22"/>
         </w:rPr>
-        <w:t xml:space="preserve">Aguinis, H., &amp; Glavas, A. (2012). What we know and don’t know about corporate social responsibility: A review and research agenda. Journal of Management, 38(4), 932-968. https://doi.org/10.1177/0149206311436079</w:t>
+        <w:t xml:space="preserve">Aguinis, H., &amp; Glavas, A. (2012). What we know and don’t know about corporate social responsibility: A review and research agenda. Journal of Management, 38(4), 932-968. </w:t>
       </w:r>
+      <w:hyperlink r:id="rId100" w:history="1">
+        <w:r>
+          <w:rPr>
+            <w:rStyle w:val="Hyperlink"/>
+            <w:rFonts w:ascii="Times New Roman" w:hAnsi="Times New Roman"/>
+            <w:color w:val="0563C1"/>
+            <w:u w:val="single"/>
+            <w:sz w:val="22"/>
+            <w:szCs w:val="22"/>
+          </w:rPr>
+          <w:t xml:space="preserve">https://doi.org/10.1177/0149206311436079</w:t>
+        </w:r>
+      </w:hyperlink>
     </w:p>
     <w:p>
       <w:pPr>
         <w:ind w:left="480" w:hanging="480"/>
+        <w:spacing w:after="80" w:line="276" w:lineRule="auto"/>
         <w:jc w:val="left"/>
-        <w:spacing w:after="80" w:line="276" w:lineRule="auto"/>
       </w:pPr>
       <w:r>
         <w:rPr>
           <w:sz w:val="22"/>
           <w:szCs w:val="22"/>
         </w:rPr>
-        <w:t xml:space="preserve">Ali, W., Wilson, J., &amp; Husnain, M. (2024). Corporate governance mechanisms and carbon disclosure: A multilevel and multitheory literature survey. Corporate Social Responsibility and Environmental Management, 31(4), 3215-3239. https://doi.org/10.1002/csr.2869</w:t>
+        <w:t xml:space="preserve">Ali, W., Wilson, J., &amp; Husnain, M. (2024). Corporate governance mechanisms and carbon disclosure: A multilevel and multitheory literature survey. Corporate Social Responsibility and Environmental Management, 31(4), 3215-3239. </w:t>
       </w:r>
+      <w:hyperlink r:id="rId101" w:history="1">
+        <w:r>
+          <w:rPr>
+            <w:rStyle w:val="Hyperlink"/>
+            <w:rFonts w:ascii="Times New Roman" w:hAnsi="Times New Roman"/>
+            <w:color w:val="0563C1"/>
+            <w:u w:val="single"/>
+            <w:sz w:val="22"/>
+            <w:szCs w:val="22"/>
+          </w:rPr>
+          <w:t xml:space="preserve">https://doi.org/10.1002/csr.2869</w:t>
+        </w:r>
+      </w:hyperlink>
     </w:p>
     <w:p>
       <w:pPr>
         <w:ind w:left="480" w:hanging="480"/>
+        <w:spacing w:after="80" w:line="276" w:lineRule="auto"/>
         <w:jc w:val="left"/>
-        <w:spacing w:after="80" w:line="276" w:lineRule="auto"/>
       </w:pPr>
       <w:r>
         <w:rPr>
           <w:sz w:val="22"/>
           <w:szCs w:val="22"/>
         </w:rPr>
-        <w:t xml:space="preserve">Alsaifi, K., Elnahass, M., &amp; Salama, A. (2020). Carbon disclosure and financial performance: UK environmental policy. Business Strategy and the Environment, 29(2), 711-726. https://doi.org/10.1002/bse.2426</w:t>
+        <w:t xml:space="preserve">Alsaifi, K., Elnahass, M., &amp; Salama, A. (2020). Carbon disclosure and financial performance: UK environmental policy. Business Strategy and the Environment, 29(2), 711-726. </w:t>
       </w:r>
+      <w:hyperlink r:id="rId102" w:history="1">
+        <w:r>
+          <w:rPr>
+            <w:rStyle w:val="Hyperlink"/>
+            <w:rFonts w:ascii="Times New Roman" w:hAnsi="Times New Roman"/>
+            <w:color w:val="0563C1"/>
+            <w:u w:val="single"/>
+            <w:sz w:val="22"/>
+            <w:szCs w:val="22"/>
+          </w:rPr>
+          <w:t xml:space="preserve">https://doi.org/10.1002/bse.2426</w:t>
+        </w:r>
+      </w:hyperlink>
     </w:p>
     <w:p>
       <w:pPr>
         <w:ind w:left="480" w:hanging="480"/>
+        <w:spacing w:after="80" w:line="276" w:lineRule="auto"/>
         <w:jc w:val="left"/>
-        <w:spacing w:after="80" w:line="276" w:lineRule="auto"/>
       </w:pPr>
       <w:r>
         <w:rPr>
           <w:sz w:val="22"/>
           <w:szCs w:val="22"/>
         </w:rPr>
-        <w:t xml:space="preserve">Ambec, S., Cohen, M. A., Elgie, S., &amp; Lanoie, P. (2013). The Porter hypothesis at 20: Can environmental regulation enhance innovation and competitiveness? Review of Environmental Economics and Policy, 7(1), 2-22. https://doi.org/10.1093/reep/ret008</w:t>
+        <w:t xml:space="preserve">Ambec, S., Cohen, M. A., Elgie, S., &amp; Lanoie, P. (2013). The Porter hypothesis at 20: Can environmental regulation enhance innovation and competitiveness? Review of Environmental Economics and Policy, 7(1), 2-22. </w:t>
       </w:r>
+      <w:hyperlink r:id="rId103" w:history="1">
+        <w:r>
+          <w:rPr>
+            <w:rStyle w:val="Hyperlink"/>
+            <w:rFonts w:ascii="Times New Roman" w:hAnsi="Times New Roman"/>
+            <w:color w:val="0563C1"/>
+            <w:u w:val="single"/>
+            <w:sz w:val="22"/>
+            <w:szCs w:val="22"/>
+          </w:rPr>
+          <w:t xml:space="preserve">https://doi.org/10.1093/reep/ret008</w:t>
+        </w:r>
+      </w:hyperlink>
     </w:p>
     <w:p>
       <w:pPr>
         <w:ind w:left="480" w:hanging="480"/>
+        <w:spacing w:after="80" w:line="276" w:lineRule="auto"/>
         <w:jc w:val="left"/>
-        <w:spacing w:after="80" w:line="276" w:lineRule="auto"/>
       </w:pPr>
       <w:r>
         <w:rPr>
           <w:sz w:val="22"/>
           <w:szCs w:val="22"/>
         </w:rPr>
-        <w:t xml:space="preserve">Aragón-Correa, J. A., Marcus, A. A., &amp; Vogel, D. (2020). The effects of mandatory and voluntary regulatory pressures on firms’ environmental strategies: A review and recommendations for future research. Academy of Management Annals, 14(1), 339-365. https://doi.org/10.5465/annals.2018.0014</w:t>
+        <w:t xml:space="preserve">Aragón-Correa, J. A., Marcus, A. A., &amp; Vogel, D. (2020). The effects of mandatory and voluntary regulatory pressures on firms’ environmental strategies: A review and recommendations for future research. Academy of Management Annals, 14(1), 339-365. </w:t>
       </w:r>
+      <w:hyperlink r:id="rId104" w:history="1">
+        <w:r>
+          <w:rPr>
+            <w:rStyle w:val="Hyperlink"/>
+            <w:rFonts w:ascii="Times New Roman" w:hAnsi="Times New Roman"/>
+            <w:color w:val="0563C1"/>
+            <w:u w:val="single"/>
+            <w:sz w:val="22"/>
+            <w:szCs w:val="22"/>
+          </w:rPr>
+          <w:t xml:space="preserve">https://doi.org/10.5465/annals.2018.0014</w:t>
+        </w:r>
+      </w:hyperlink>
     </w:p>
     <w:p>
       <w:pPr>
         <w:ind w:left="480" w:hanging="480"/>
+        <w:spacing w:after="80" w:line="276" w:lineRule="auto"/>
         <w:jc w:val="left"/>
-        <w:spacing w:after="80" w:line="276" w:lineRule="auto"/>
       </w:pPr>
       <w:r>
         <w:rPr>
           <w:sz w:val="22"/>
           <w:szCs w:val="22"/>
         </w:rPr>
-        <w:t xml:space="preserve">Bae, S. M., Masud, M. A. K., &amp; Kim, J. D. (2018). A cross-country investigation of corporate governance and corporate sustainability disclosure: A signaling theory perspective. Sustainability, 10(8), 2611. https://doi.org/10.3390/su10082611</w:t>
+        <w:t xml:space="preserve">Bae, S. M., Masud, M. A. K., &amp; Kim, J. D. (2018). A cross-country investigation of corporate governance and corporate sustainability disclosure: A signaling theory perspective. Sustainability, 10(8), 2611. </w:t>
       </w:r>
+      <w:hyperlink r:id="rId105" w:history="1">
+        <w:r>
+          <w:rPr>
+            <w:rStyle w:val="Hyperlink"/>
+            <w:rFonts w:ascii="Times New Roman" w:hAnsi="Times New Roman"/>
+            <w:color w:val="0563C1"/>
+            <w:u w:val="single"/>
+            <w:sz w:val="22"/>
+            <w:szCs w:val="22"/>
+          </w:rPr>
+          <w:t xml:space="preserve">https://doi.org/10.3390/su10082611</w:t>
+        </w:r>
+      </w:hyperlink>
     </w:p>
     <w:p>
       <w:pPr>
         <w:ind w:left="480" w:hanging="480"/>
+        <w:spacing w:after="80" w:line="276" w:lineRule="auto"/>
         <w:jc w:val="left"/>
-        <w:spacing w:after="80" w:line="276" w:lineRule="auto"/>
       </w:pPr>
       <w:r>
         <w:rPr>
           <w:sz w:val="22"/>
           <w:szCs w:val="22"/>
         </w:rPr>
-        <w:t xml:space="preserve">Bansal, P., &amp; Clelland, I. (2004). Talking trash: Legitimacy, impression management, and unsystematic risk in the context of the natural environment. Academy of Management Journal, 47(1), 93-103. https://doi.org/10.5465/20159562</w:t>
+        <w:t xml:space="preserve">Bansal, P., &amp; Clelland, I. (2004). Talking trash: Legitimacy, impression management, and unsystematic risk in the context of the natural environment. Academy of Management Journal, 47(1), 93-103. </w:t>
       </w:r>
+      <w:hyperlink r:id="rId106" w:history="1">
+        <w:r>
+          <w:rPr>
+            <w:rStyle w:val="Hyperlink"/>
+            <w:rFonts w:ascii="Times New Roman" w:hAnsi="Times New Roman"/>
+            <w:color w:val="0563C1"/>
+            <w:u w:val="single"/>
+            <w:sz w:val="22"/>
+            <w:szCs w:val="22"/>
+          </w:rPr>
+          <w:t xml:space="preserve">https://doi.org/10.5465/20159562</w:t>
+        </w:r>
+      </w:hyperlink>
     </w:p>
     <w:p>
       <w:pPr>
         <w:ind w:left="480" w:hanging="480"/>
+        <w:spacing w:after="80" w:line="276" w:lineRule="auto"/>
         <w:jc w:val="left"/>
-        <w:spacing w:after="80" w:line="276" w:lineRule="auto"/>
       </w:pPr>
       <w:r>
         <w:rPr>
           <w:sz w:val="22"/>
           <w:szCs w:val="22"/>
         </w:rPr>
-        <w:t xml:space="preserve">Berchicci, L., &amp; King, A. (2007). Postcards from the edge: A review of the business and environment literature. Academy of Management Annals, 1(1), 513-547. https://doi.org/10.5465/078559816</w:t>
+        <w:t xml:space="preserve">Berchicci, L., &amp; King, A. (2007). Postcards from the edge: A review of the business and environment literature. Academy of Management Annals, 1(1), 513-547. </w:t>
       </w:r>
+      <w:hyperlink r:id="rId107" w:history="1">
+        <w:r>
+          <w:rPr>
+            <w:rStyle w:val="Hyperlink"/>
+            <w:rFonts w:ascii="Times New Roman" w:hAnsi="Times New Roman"/>
+            <w:color w:val="0563C1"/>
+            <w:u w:val="single"/>
+            <w:sz w:val="22"/>
+            <w:szCs w:val="22"/>
+          </w:rPr>
+          <w:t xml:space="preserve">https://doi.org/10.5465/078559816</w:t>
+        </w:r>
+      </w:hyperlink>
     </w:p>
     <w:p>
       <w:pPr>
         <w:ind w:left="480" w:hanging="480"/>
+        <w:spacing w:after="80" w:line="276" w:lineRule="auto"/>
         <w:jc w:val="left"/>
-        <w:spacing w:after="80" w:line="276" w:lineRule="auto"/>
       </w:pPr>
       <w:r>
         <w:rPr>
           <w:sz w:val="22"/>
           <w:szCs w:val="22"/>
         </w:rPr>
-        <w:t xml:space="preserve">Berg, F., Kölbel, J. F., &amp; Rigobon, R. (2022). Aggregate confusion: The divergence of ESG ratings. Review of Finance, 26(6), 1315-1344. https://doi.org/10.1093/rof/rfac033</w:t>
+        <w:t xml:space="preserve">Berg, F., Kölbel, J. F., &amp; Rigobon, R. (2022). Aggregate confusion: The divergence of ESG ratings. Review of Finance, 26(6), 1315-1344. </w:t>
       </w:r>
+      <w:hyperlink r:id="rId108" w:history="1">
+        <w:r>
+          <w:rPr>
+            <w:rStyle w:val="Hyperlink"/>
+            <w:rFonts w:ascii="Times New Roman" w:hAnsi="Times New Roman"/>
+            <w:color w:val="0563C1"/>
+            <w:u w:val="single"/>
+            <w:sz w:val="22"/>
+            <w:szCs w:val="22"/>
+          </w:rPr>
+          <w:t xml:space="preserve">https://doi.org/10.1093/rof/rfac033</w:t>
+        </w:r>
+      </w:hyperlink>
     </w:p>
     <w:p>
       <w:pPr>
         <w:ind w:left="480" w:hanging="480"/>
+        <w:spacing w:after="80" w:line="276" w:lineRule="auto"/>
         <w:jc w:val="left"/>
-        <w:spacing w:after="80" w:line="276" w:lineRule="auto"/>
       </w:pPr>
       <w:r>
         <w:rPr>
           <w:sz w:val="22"/>
           <w:szCs w:val="22"/>
         </w:rPr>
-        <w:t xml:space="preserve">Berrone, P., &amp; Gomez-Mejia, L. R. (2009). Environmental performance and executive compensation: An integrated agency-institutional perspective. Academy of Management Journal, 52(1), 103-126. https://doi.org/10.5465/AMJ.2009.36461950</w:t>
+        <w:t xml:space="preserve">Berrone, P., &amp; Gomez-Mejia, L. R. (2009). Environmental performance and executive compensation: An integrated agency-institutional perspective. Academy of Management Journal, 52(1), 103-126. </w:t>
       </w:r>
+      <w:hyperlink r:id="rId109" w:history="1">
+        <w:r>
+          <w:rPr>
+            <w:rStyle w:val="Hyperlink"/>
+            <w:rFonts w:ascii="Times New Roman" w:hAnsi="Times New Roman"/>
+            <w:color w:val="0563C1"/>
+            <w:u w:val="single"/>
+            <w:sz w:val="22"/>
+            <w:szCs w:val="22"/>
+          </w:rPr>
+          <w:t xml:space="preserve">https://doi.org/10.5465/AMJ.2009.36461950</w:t>
+        </w:r>
+      </w:hyperlink>
     </w:p>
     <w:p>
       <w:pPr>
         <w:ind w:left="480" w:hanging="480"/>
+        <w:spacing w:after="80" w:line="276" w:lineRule="auto"/>
         <w:jc w:val="left"/>
-        <w:spacing w:after="80" w:line="276" w:lineRule="auto"/>
       </w:pPr>
       <w:r>
         <w:rPr>
           <w:sz w:val="22"/>
           <w:szCs w:val="22"/>
         </w:rPr>
-        <w:t xml:space="preserve">Berrone, P., Fosfuri, A., Gelabert, L., &amp; Gomez-Mejia, L. R. (2013). Necessity as the mother of green inventions: Institutional pressures and environmental innovations. Strategic Management Journal, 34(8), 891-909. https://doi.org/10.1002/smj.2041</w:t>
+        <w:t xml:space="preserve">Berrone, P., Fosfuri, A., Gelabert, L., &amp; Gomez-Mejia, L. R. (2013). Necessity as the mother of green inventions: Institutional pressures and environmental innovations. Strategic Management Journal, 34(8), 891-909. </w:t>
       </w:r>
+      <w:hyperlink r:id="rId110" w:history="1">
+        <w:r>
+          <w:rPr>
+            <w:rStyle w:val="Hyperlink"/>
+            <w:rFonts w:ascii="Times New Roman" w:hAnsi="Times New Roman"/>
+            <w:color w:val="0563C1"/>
+            <w:u w:val="single"/>
+            <w:sz w:val="22"/>
+            <w:szCs w:val="22"/>
+          </w:rPr>
+          <w:t xml:space="preserve">https://doi.org/10.1002/smj.2041</w:t>
+        </w:r>
+      </w:hyperlink>
     </w:p>
     <w:p>
       <w:pPr>
         <w:ind w:left="480" w:hanging="480"/>
+        <w:spacing w:after="80" w:line="276" w:lineRule="auto"/>
         <w:jc w:val="left"/>
-        <w:spacing w:after="80" w:line="276" w:lineRule="auto"/>
       </w:pPr>
       <w:r>
         <w:rPr>
           <w:sz w:val="22"/>
           <w:szCs w:val="22"/>
         </w:rPr>
-        <w:t xml:space="preserve">Bertrand, M., Duflo, E., &amp; Mullainathan, S. (2004). How much should we trust differences-in-differences estimates? Quarterly Journal of Economics, 119(1), 249-275. https://doi.org/10.1162/003355304772839588</w:t>
+        <w:t xml:space="preserve">Bertrand, M., Duflo, E., &amp; Mullainathan, S. (2004). How much should we trust differences-in-differences estimates? Quarterly Journal of Economics, 119(1), 249-275. </w:t>
       </w:r>
+      <w:hyperlink r:id="rId111" w:history="1">
+        <w:r>
+          <w:rPr>
+            <w:rStyle w:val="Hyperlink"/>
+            <w:rFonts w:ascii="Times New Roman" w:hAnsi="Times New Roman"/>
+            <w:color w:val="0563C1"/>
+            <w:u w:val="single"/>
+            <w:sz w:val="22"/>
+            <w:szCs w:val="22"/>
+          </w:rPr>
+          <w:t xml:space="preserve">https://doi.org/10.1162/003355304772839588</w:t>
+        </w:r>
+      </w:hyperlink>
     </w:p>
     <w:p>
       <w:pPr>
         <w:ind w:left="480" w:hanging="480"/>
+        <w:spacing w:after="80" w:line="276" w:lineRule="auto"/>
         <w:jc w:val="left"/>
-        <w:spacing w:after="80" w:line="276" w:lineRule="auto"/>
       </w:pPr>
       <w:r>
         <w:rPr>
           <w:sz w:val="22"/>
           <w:szCs w:val="22"/>
         </w:rPr>
-        <w:t xml:space="preserve">Bettarelli, L., Furceri, D., Pizzuto, P., &amp; Shakoor, N. (2025). Do climate policies affect green patenting patterns? Energy Economics, 150, 108834. https://doi.org/10.1016/j.eneco.2025.108834</w:t>
+        <w:t xml:space="preserve">Bettarelli, L., Furceri, D., Pizzuto, P., &amp; Shakoor, N. (2025). Do climate policies affect green patenting patterns? Energy Economics, 150, 108834. </w:t>
       </w:r>
+      <w:hyperlink r:id="rId112" w:history="1">
+        <w:r>
+          <w:rPr>
+            <w:rStyle w:val="Hyperlink"/>
+            <w:rFonts w:ascii="Times New Roman" w:hAnsi="Times New Roman"/>
+            <w:color w:val="0563C1"/>
+            <w:u w:val="single"/>
+            <w:sz w:val="22"/>
+            <w:szCs w:val="22"/>
+          </w:rPr>
+          <w:t xml:space="preserve">https://doi.org/10.1016/j.eneco.2025.108834</w:t>
+        </w:r>
+      </w:hyperlink>
     </w:p>
     <w:p>
       <w:pPr>
         <w:ind w:left="480" w:hanging="480"/>
+        <w:spacing w:after="80" w:line="276" w:lineRule="auto"/>
         <w:jc w:val="left"/>
-        <w:spacing w:after="80" w:line="276" w:lineRule="auto"/>
       </w:pPr>
       <w:r>
         <w:rPr>
           <w:sz w:val="22"/>
           <w:szCs w:val="22"/>
         </w:rPr>
-        <w:t xml:space="preserve">Bhuiyan, F., Rana, T., Baird, K., &amp; Munir, R. (2023). Strategic outcome of competitive advantage from corporate sustainability practices: Institutional theory perspective from an emerging economy. Business Strategy and the Environment, 32(7), 4217-4243. https://doi.org/10.1002/bse.3362</w:t>
+        <w:t xml:space="preserve">Bhuiyan, F., Rana, T., Baird, K., &amp; Munir, R. (2023). Strategic outcome of competitive advantage from corporate sustainability practices: Institutional theory perspective from an emerging economy. Business Strategy and the Environment, 32(7), 4217-4243. </w:t>
       </w:r>
+      <w:hyperlink r:id="rId113" w:history="1">
+        <w:r>
+          <w:rPr>
+            <w:rStyle w:val="Hyperlink"/>
+            <w:rFonts w:ascii="Times New Roman" w:hAnsi="Times New Roman"/>
+            <w:color w:val="0563C1"/>
+            <w:u w:val="single"/>
+            <w:sz w:val="22"/>
+            <w:szCs w:val="22"/>
+          </w:rPr>
+          <w:t xml:space="preserve">https://doi.org/10.1002/bse.3362</w:t>
+        </w:r>
+      </w:hyperlink>
     </w:p>
     <w:p>
       <w:pPr>
         <w:ind w:left="480" w:hanging="480"/>
+        <w:spacing w:after="80" w:line="276" w:lineRule="auto"/>
         <w:jc w:val="left"/>
-        <w:spacing w:after="80" w:line="276" w:lineRule="auto"/>
       </w:pPr>
       <w:r>
         <w:rPr>
           <w:sz w:val="22"/>
           <w:szCs w:val="22"/>
         </w:rPr>
-        <w:t xml:space="preserve">Bodansky, D. (2016). The legal character of the Paris Agreement. Review of European, Comparative &amp; International Environmental Law, 25(2), 142-150. https://doi.org/10.1111/reel.12154</w:t>
+        <w:t xml:space="preserve">Bodansky, D. (2016). The legal character of the Paris Agreement. Review of European, Comparative &amp; International Environmental Law, 25(2), 142-150. </w:t>
       </w:r>
+      <w:hyperlink r:id="rId114" w:history="1">
+        <w:r>
+          <w:rPr>
+            <w:rStyle w:val="Hyperlink"/>
+            <w:rFonts w:ascii="Times New Roman" w:hAnsi="Times New Roman"/>
+            <w:color w:val="0563C1"/>
+            <w:u w:val="single"/>
+            <w:sz w:val="22"/>
+            <w:szCs w:val="22"/>
+          </w:rPr>
+          <w:t xml:space="preserve">https://doi.org/10.1111/reel.12154</w:t>
+        </w:r>
+      </w:hyperlink>
     </w:p>
     <w:p>
       <w:pPr>
         <w:ind w:left="480" w:hanging="480"/>
+        <w:spacing w:after="80" w:line="276" w:lineRule="auto"/>
         <w:jc w:val="left"/>
-        <w:spacing w:after="80" w:line="276" w:lineRule="auto"/>
       </w:pPr>
       <w:r>
         <w:rPr>
           <w:sz w:val="22"/>
           <w:szCs w:val="22"/>
         </w:rPr>
-        <w:t xml:space="preserve">Boiral, O., Brotherton, M.-C., &amp; Talbot, D. (2024). What you see is what you get? Building confidence in ESG disclosures for sustainable finance through external assurance. Business Ethics, the Environment &amp; Responsibility, 33(4), 617-632. https://doi.org/10.1111/beer.12630</w:t>
+        <w:t xml:space="preserve">Boiral, O., Brotherton, M.-C., &amp; Talbot, D. (2024). What you see is what you get? Building confidence in ESG disclosures for sustainable finance through external assurance. Business Ethics, the Environment &amp; Responsibility, 33(4), 617-632. </w:t>
       </w:r>
+      <w:hyperlink r:id="rId115" w:history="1">
+        <w:r>
+          <w:rPr>
+            <w:rStyle w:val="Hyperlink"/>
+            <w:rFonts w:ascii="Times New Roman" w:hAnsi="Times New Roman"/>
+            <w:color w:val="0563C1"/>
+            <w:u w:val="single"/>
+            <w:sz w:val="22"/>
+            <w:szCs w:val="22"/>
+          </w:rPr>
+          <w:t xml:space="preserve">https://doi.org/10.1111/beer.12630</w:t>
+        </w:r>
+      </w:hyperlink>
     </w:p>
     <w:p>
       <w:pPr>
         <w:ind w:left="480" w:hanging="480"/>
+        <w:spacing w:after="80" w:line="276" w:lineRule="auto"/>
         <w:jc w:val="left"/>
-        <w:spacing w:after="80" w:line="276" w:lineRule="auto"/>
       </w:pPr>
       <w:r>
         <w:rPr>
           <w:sz w:val="22"/>
           <w:szCs w:val="22"/>
         </w:rPr>
-        <w:t xml:space="preserve">Bolton, P., &amp; Kacperczyk, M. (2021). Do investors care about carbon risk? Journal of Financial Economics, 142(2), 517-549. https://doi.org/10.1016/j.jfineco.2021.05.008</w:t>
+        <w:t xml:space="preserve">Bolton, P., &amp; Kacperczyk, M. (2021). Do investors care about carbon risk? Journal of Financial Economics, 142(2), 517-549. </w:t>
       </w:r>
+      <w:hyperlink r:id="rId116" w:history="1">
+        <w:r>
+          <w:rPr>
+            <w:rStyle w:val="Hyperlink"/>
+            <w:rFonts w:ascii="Times New Roman" w:hAnsi="Times New Roman"/>
+            <w:color w:val="0563C1"/>
+            <w:u w:val="single"/>
+            <w:sz w:val="22"/>
+            <w:szCs w:val="22"/>
+          </w:rPr>
+          <w:t xml:space="preserve">https://doi.org/10.1016/j.jfineco.2021.05.008</w:t>
+        </w:r>
+      </w:hyperlink>
     </w:p>
     <w:p>
       <w:pPr>
         <w:ind w:left="480" w:hanging="480"/>
+        <w:spacing w:after="80" w:line="276" w:lineRule="auto"/>
         <w:jc w:val="left"/>
-        <w:spacing w:after="80" w:line="276" w:lineRule="auto"/>
       </w:pPr>
       <w:r>
         <w:rPr>
@@ -22949,22 +23170,35 @@
     <w:p>
       <w:pPr>
         <w:ind w:left="480" w:hanging="480"/>
+        <w:spacing w:after="80" w:line="276" w:lineRule="auto"/>
         <w:jc w:val="left"/>
-        <w:spacing w:after="80" w:line="276" w:lineRule="auto"/>
       </w:pPr>
       <w:r>
         <w:rPr>
           <w:sz w:val="22"/>
           <w:szCs w:val="22"/>
         </w:rPr>
-        <w:t xml:space="preserve">Borghei, Z. (2021). Carbon disclosure: A systematic literature review. Accounting &amp; Finance, 61(4), 5255-5280. https://doi.org/10.1111/acfi.12757</w:t>
+        <w:t xml:space="preserve">Borghei, Z. (2021). Carbon disclosure: A systematic literature review. Accounting &amp; Finance, 61(4), 5255-5280. </w:t>
       </w:r>
+      <w:hyperlink r:id="rId117" w:history="1">
+        <w:r>
+          <w:rPr>
+            <w:rStyle w:val="Hyperlink"/>
+            <w:rFonts w:ascii="Times New Roman" w:hAnsi="Times New Roman"/>
+            <w:color w:val="0563C1"/>
+            <w:u w:val="single"/>
+            <w:sz w:val="22"/>
+            <w:szCs w:val="22"/>
+          </w:rPr>
+          <w:t xml:space="preserve">https://doi.org/10.1111/acfi.12757</w:t>
+        </w:r>
+      </w:hyperlink>
     </w:p>
     <w:p>
       <w:pPr>
         <w:ind w:left="480" w:hanging="480"/>
+        <w:spacing w:after="80" w:line="276" w:lineRule="auto"/>
         <w:jc w:val="left"/>
-        <w:spacing w:after="80" w:line="276" w:lineRule="auto"/>
       </w:pPr>
       <w:r>
         <w:rPr>
@@ -22977,148 +23211,278 @@
     <w:p>
       <w:pPr>
         <w:ind w:left="480" w:hanging="480"/>
+        <w:spacing w:after="80" w:line="276" w:lineRule="auto"/>
         <w:jc w:val="left"/>
-        <w:spacing w:after="80" w:line="276" w:lineRule="auto"/>
       </w:pPr>
       <w:r>
         <w:rPr>
           <w:sz w:val="22"/>
           <w:szCs w:val="22"/>
         </w:rPr>
-        <w:t xml:space="preserve">Callaway, B., &amp; Sant’Anna, P. H. C. (2021). Difference-in-differences with multiple time periods. Journal of Econometrics, 225(2), 200-230. https://doi.org/10.1016/j.jeconom.2020.12.001</w:t>
+        <w:t xml:space="preserve">Callaway, B., &amp; Sant’Anna, P. H. C. (2021). Difference-in-differences with multiple time periods. Journal of Econometrics, 225(2), 200-230. </w:t>
       </w:r>
+      <w:hyperlink r:id="rId118" w:history="1">
+        <w:r>
+          <w:rPr>
+            <w:rStyle w:val="Hyperlink"/>
+            <w:rFonts w:ascii="Times New Roman" w:hAnsi="Times New Roman"/>
+            <w:color w:val="0563C1"/>
+            <w:u w:val="single"/>
+            <w:sz w:val="22"/>
+            <w:szCs w:val="22"/>
+          </w:rPr>
+          <w:t xml:space="preserve">https://doi.org/10.1016/j.jeconom.2020.12.001</w:t>
+        </w:r>
+      </w:hyperlink>
     </w:p>
     <w:p>
       <w:pPr>
         <w:ind w:left="480" w:hanging="480"/>
+        <w:spacing w:after="80" w:line="276" w:lineRule="auto"/>
         <w:jc w:val="left"/>
-        <w:spacing w:after="80" w:line="276" w:lineRule="auto"/>
       </w:pPr>
       <w:r>
         <w:rPr>
           <w:sz w:val="22"/>
           <w:szCs w:val="22"/>
         </w:rPr>
-        <w:t xml:space="preserve">Cepêda, C., Monteiro, A. P., &amp; Aibar-Guzmán, B. (2025). Bridging the ESG credibility gap: The role of institutional investors in mitigating ESG decoupling. Business Strategy and the Environment, 34(6), 7139-7160. https://doi.org/10.1002/bse.4336</w:t>
+        <w:t xml:space="preserve">Cepêda, C., Monteiro, A. P., &amp; Aibar-Guzmán, B. (2025). Bridging the ESG credibility gap: The role of institutional investors in mitigating ESG decoupling. Business Strategy and the Environment, 34(6), 7139-7160. </w:t>
       </w:r>
+      <w:hyperlink r:id="rId119" w:history="1">
+        <w:r>
+          <w:rPr>
+            <w:rStyle w:val="Hyperlink"/>
+            <w:rFonts w:ascii="Times New Roman" w:hAnsi="Times New Roman"/>
+            <w:color w:val="0563C1"/>
+            <w:u w:val="single"/>
+            <w:sz w:val="22"/>
+            <w:szCs w:val="22"/>
+          </w:rPr>
+          <w:t xml:space="preserve">https://doi.org/10.1002/bse.4336</w:t>
+        </w:r>
+      </w:hyperlink>
     </w:p>
     <w:p>
       <w:pPr>
         <w:ind w:left="480" w:hanging="480"/>
+        <w:spacing w:after="80" w:line="276" w:lineRule="auto"/>
         <w:jc w:val="left"/>
-        <w:spacing w:after="80" w:line="276" w:lineRule="auto"/>
       </w:pPr>
       <w:r>
         <w:rPr>
           <w:sz w:val="22"/>
           <w:szCs w:val="22"/>
         </w:rPr>
-        <w:t xml:space="preserve">Cho, C. H., &amp; Patten, D. M. (2007). The role of environmental disclosures as tools of legitimacy: A research note. Accounting, Organizations and Society, 32(7-8), 639-647. https://doi.org/10.1016/j.aos.2006.09.009</w:t>
+        <w:t xml:space="preserve">Cho, C. H., &amp; Patten, D. M. (2007). The role of environmental disclosures as tools of legitimacy: A research note. Accounting, Organizations and Society, 32(7-8), 639-647. </w:t>
       </w:r>
+      <w:hyperlink r:id="rId120" w:history="1">
+        <w:r>
+          <w:rPr>
+            <w:rStyle w:val="Hyperlink"/>
+            <w:rFonts w:ascii="Times New Roman" w:hAnsi="Times New Roman"/>
+            <w:color w:val="0563C1"/>
+            <w:u w:val="single"/>
+            <w:sz w:val="22"/>
+            <w:szCs w:val="22"/>
+          </w:rPr>
+          <w:t xml:space="preserve">https://doi.org/10.1016/j.aos.2006.09.009</w:t>
+        </w:r>
+      </w:hyperlink>
     </w:p>
     <w:p>
       <w:pPr>
         <w:ind w:left="480" w:hanging="480"/>
+        <w:spacing w:after="80" w:line="276" w:lineRule="auto"/>
         <w:jc w:val="left"/>
-        <w:spacing w:after="80" w:line="276" w:lineRule="auto"/>
       </w:pPr>
       <w:r>
         <w:rPr>
           <w:sz w:val="22"/>
           <w:szCs w:val="22"/>
         </w:rPr>
-        <w:t xml:space="preserve">Cho, C. H., Laine, M., Roberts, R. W., &amp; Rodrigue, M. (2015). Organized hypocrisy, organizational façades, and sustainability reporting. Accounting, Organizations and Society, 40, 78-94. https://doi.org/10.1016/j.aos.2014.12.003</w:t>
+        <w:t xml:space="preserve">Cho, C. H., Laine, M., Roberts, R. W., &amp; Rodrigue, M. (2015). Organized hypocrisy, organizational façades, and sustainability reporting. Accounting, Organizations and Society, 40, 78-94. </w:t>
       </w:r>
+      <w:hyperlink r:id="rId121" w:history="1">
+        <w:r>
+          <w:rPr>
+            <w:rStyle w:val="Hyperlink"/>
+            <w:rFonts w:ascii="Times New Roman" w:hAnsi="Times New Roman"/>
+            <w:color w:val="0563C1"/>
+            <w:u w:val="single"/>
+            <w:sz w:val="22"/>
+            <w:szCs w:val="22"/>
+          </w:rPr>
+          <w:t xml:space="preserve">https://doi.org/10.1016/j.aos.2014.12.003</w:t>
+        </w:r>
+      </w:hyperlink>
     </w:p>
     <w:p>
       <w:pPr>
         <w:ind w:left="480" w:hanging="480"/>
+        <w:spacing w:after="80" w:line="276" w:lineRule="auto"/>
         <w:jc w:val="left"/>
-        <w:spacing w:after="80" w:line="276" w:lineRule="auto"/>
       </w:pPr>
       <w:r>
         <w:rPr>
           <w:sz w:val="22"/>
           <w:szCs w:val="22"/>
         </w:rPr>
-        <w:t xml:space="preserve">Cho, C. H., Roberts, R. W., &amp; Patten, D. M. (2010). The language of US corporate environmental disclosure. Accounting, Organizations and Society, 35(4), 431-443. https://doi.org/10.1016/j.aos.2009.10.002</w:t>
+        <w:t xml:space="preserve">Cho, C. H., Roberts, R. W., &amp; Patten, D. M. (2010). The language of US corporate environmental disclosure. Accounting, Organizations and Society, 35(4), 431-443. </w:t>
       </w:r>
+      <w:hyperlink r:id="rId122" w:history="1">
+        <w:r>
+          <w:rPr>
+            <w:rStyle w:val="Hyperlink"/>
+            <w:rFonts w:ascii="Times New Roman" w:hAnsi="Times New Roman"/>
+            <w:color w:val="0563C1"/>
+            <w:u w:val="single"/>
+            <w:sz w:val="22"/>
+            <w:szCs w:val="22"/>
+          </w:rPr>
+          <w:t xml:space="preserve">https://doi.org/10.1016/j.aos.2009.10.002</w:t>
+        </w:r>
+      </w:hyperlink>
     </w:p>
     <w:p>
       <w:pPr>
         <w:ind w:left="480" w:hanging="480"/>
+        <w:spacing w:after="80" w:line="276" w:lineRule="auto"/>
         <w:jc w:val="left"/>
-        <w:spacing w:after="80" w:line="276" w:lineRule="auto"/>
       </w:pPr>
       <w:r>
         <w:rPr>
           <w:sz w:val="22"/>
           <w:szCs w:val="22"/>
         </w:rPr>
-        <w:t xml:space="preserve">Christensen, H. B., Hail, L., &amp; Leuz, C. (2021). Mandatory CSR and sustainability reporting: Economic analysis and literature review. Review of Accounting Studies, 26, 1176-1248. https://doi.org/10.1007/s11142-021-09609-5</w:t>
+        <w:t xml:space="preserve">Christensen, H. B., Hail, L., &amp; Leuz, C. (2021). Mandatory CSR and sustainability reporting: Economic analysis and literature review. Review of Accounting Studies, 26, 1176-1248. </w:t>
       </w:r>
+      <w:hyperlink r:id="rId123" w:history="1">
+        <w:r>
+          <w:rPr>
+            <w:rStyle w:val="Hyperlink"/>
+            <w:rFonts w:ascii="Times New Roman" w:hAnsi="Times New Roman"/>
+            <w:color w:val="0563C1"/>
+            <w:u w:val="single"/>
+            <w:sz w:val="22"/>
+            <w:szCs w:val="22"/>
+          </w:rPr>
+          <w:t xml:space="preserve">https://doi.org/10.1007/s11142-021-09609-5</w:t>
+        </w:r>
+      </w:hyperlink>
     </w:p>
     <w:p>
       <w:pPr>
         <w:ind w:left="480" w:hanging="480"/>
+        <w:spacing w:after="80" w:line="276" w:lineRule="auto"/>
         <w:jc w:val="left"/>
-        <w:spacing w:after="80" w:line="276" w:lineRule="auto"/>
       </w:pPr>
       <w:r>
         <w:rPr>
           <w:sz w:val="22"/>
           <w:szCs w:val="22"/>
         </w:rPr>
-        <w:t xml:space="preserve">Clarkson, P. M., Li, Y., Richardson, G. D., &amp; Vasvari, F. P. (2008). Revisiting the relation between environmental performance and environmental disclosure: An empirical analysis. Accounting, Organizations and Society, 33(4-5), 303-327. https://doi.org/10.1016/j.aos.2007.05.003</w:t>
+        <w:t xml:space="preserve">Clarkson, P. M., Li, Y., Richardson, G. D., &amp; Vasvari, F. P. (2008). Revisiting the relation between environmental performance and environmental disclosure: An empirical analysis. Accounting, Organizations and Society, 33(4-5), 303-327. </w:t>
       </w:r>
+      <w:hyperlink r:id="rId124" w:history="1">
+        <w:r>
+          <w:rPr>
+            <w:rStyle w:val="Hyperlink"/>
+            <w:rFonts w:ascii="Times New Roman" w:hAnsi="Times New Roman"/>
+            <w:color w:val="0563C1"/>
+            <w:u w:val="single"/>
+            <w:sz w:val="22"/>
+            <w:szCs w:val="22"/>
+          </w:rPr>
+          <w:t xml:space="preserve">https://doi.org/10.1016/j.aos.2007.05.003</w:t>
+        </w:r>
+      </w:hyperlink>
     </w:p>
     <w:p>
       <w:pPr>
         <w:ind w:left="480" w:hanging="480"/>
+        <w:spacing w:after="80" w:line="276" w:lineRule="auto"/>
         <w:jc w:val="left"/>
-        <w:spacing w:after="80" w:line="276" w:lineRule="auto"/>
       </w:pPr>
       <w:r>
         <w:rPr>
           <w:sz w:val="22"/>
           <w:szCs w:val="22"/>
         </w:rPr>
-        <w:t xml:space="preserve">Clementino, E., &amp; Perkins, R. (2021). How do companies respond to environmental, social and governance (ESG) ratings? Evidence from Italy. Journal of Business Ethics, 171(2), 379-397. https://doi.org/10.1007/s10551-020-04441-4</w:t>
+        <w:t xml:space="preserve">Clementino, E., &amp; Perkins, R. (2021). How do companies respond to environmental, social and governance (ESG) ratings? Evidence from Italy. Journal of Business Ethics, 171(2), 379-397. </w:t>
       </w:r>
+      <w:hyperlink r:id="rId125" w:history="1">
+        <w:r>
+          <w:rPr>
+            <w:rStyle w:val="Hyperlink"/>
+            <w:rFonts w:ascii="Times New Roman" w:hAnsi="Times New Roman"/>
+            <w:color w:val="0563C1"/>
+            <w:u w:val="single"/>
+            <w:sz w:val="22"/>
+            <w:szCs w:val="22"/>
+          </w:rPr>
+          <w:t xml:space="preserve">https://doi.org/10.1007/s10551-020-04441-4</w:t>
+        </w:r>
+      </w:hyperlink>
     </w:p>
     <w:p>
       <w:pPr>
         <w:ind w:left="480" w:hanging="480"/>
+        <w:spacing w:after="80" w:line="276" w:lineRule="auto"/>
         <w:jc w:val="left"/>
-        <w:spacing w:after="80" w:line="276" w:lineRule="auto"/>
       </w:pPr>
       <w:r>
         <w:rPr>
           <w:sz w:val="22"/>
           <w:szCs w:val="22"/>
         </w:rPr>
-        <w:t xml:space="preserve">Cohen, L., Gurun, U. G., &amp; Nguyen, Q. H. (2020). The ESG-innovation disconnect: Evidence from green patenting. National Bureau of Economic Research working paper 27990. https://doi.org/10.1287/mnsc.2024.09124</w:t>
+        <w:t xml:space="preserve">Cohen, L., Gurun, U. G., &amp; Nguyen, Q. H. (2020). The ESG-innovation disconnect: Evidence from green patenting. National Bureau of Economic Research working paper 27990. </w:t>
       </w:r>
+      <w:hyperlink r:id="rId126" w:history="1">
+        <w:r>
+          <w:rPr>
+            <w:rStyle w:val="Hyperlink"/>
+            <w:rFonts w:ascii="Times New Roman" w:hAnsi="Times New Roman"/>
+            <w:color w:val="0563C1"/>
+            <w:u w:val="single"/>
+            <w:sz w:val="22"/>
+            <w:szCs w:val="22"/>
+          </w:rPr>
+          <w:t xml:space="preserve">https://doi.org/10.1287/mnsc.2024.09124</w:t>
+        </w:r>
+      </w:hyperlink>
     </w:p>
     <w:p>
       <w:pPr>
         <w:ind w:left="480" w:hanging="480"/>
+        <w:spacing w:after="80" w:line="276" w:lineRule="auto"/>
         <w:jc w:val="left"/>
-        <w:spacing w:after="80" w:line="276" w:lineRule="auto"/>
       </w:pPr>
       <w:r>
         <w:rPr>
           <w:sz w:val="22"/>
           <w:szCs w:val="22"/>
         </w:rPr>
-        <w:t xml:space="preserve">Cohen, M. A., &amp; Tubb, A. (2018). The impact of environmental regulation on firm and country competitiveness: A meta-analysis of the Porter hypothesis. Journal of the Association of Environmental and Resource Economists, 5(2), 371-399. https://doi.org/10.1086/695613</w:t>
+        <w:t xml:space="preserve">Cohen, M. A., &amp; Tubb, A. (2018). The impact of environmental regulation on firm and country competitiveness: A meta-analysis of the Porter hypothesis. Journal of the Association of Environmental and Resource Economists, 5(2), 371-399. </w:t>
       </w:r>
+      <w:hyperlink r:id="rId127" w:history="1">
+        <w:r>
+          <w:rPr>
+            <w:rStyle w:val="Hyperlink"/>
+            <w:rFonts w:ascii="Times New Roman" w:hAnsi="Times New Roman"/>
+            <w:color w:val="0563C1"/>
+            <w:u w:val="single"/>
+            <w:sz w:val="22"/>
+            <w:szCs w:val="22"/>
+          </w:rPr>
+          <w:t xml:space="preserve">https://doi.org/10.1086/695613</w:t>
+        </w:r>
+      </w:hyperlink>
     </w:p>
     <w:p>
       <w:pPr>
         <w:ind w:left="480" w:hanging="480"/>
+        <w:spacing w:after="80" w:line="276" w:lineRule="auto"/>
         <w:jc w:val="left"/>
-        <w:spacing w:after="80" w:line="276" w:lineRule="auto"/>
       </w:pPr>
       <w:r>
         <w:rPr>
@@ -23131,176 +23495,332 @@
     <w:p>
       <w:pPr>
         <w:ind w:left="480" w:hanging="480"/>
+        <w:spacing w:after="80" w:line="276" w:lineRule="auto"/>
         <w:jc w:val="left"/>
-        <w:spacing w:after="80" w:line="276" w:lineRule="auto"/>
       </w:pPr>
       <w:r>
         <w:rPr>
           <w:sz w:val="22"/>
           <w:szCs w:val="22"/>
         </w:rPr>
-        <w:t xml:space="preserve">Cormier, D., &amp; Gordon, I. M. (2001). An examination of social and environmental reporting strategies. Accounting, Auditing &amp; Accountability Journal, 14(5), 587-617. https://doi.org/10.1108/EUM0000000006264</w:t>
+        <w:t xml:space="preserve">Cormier, D., &amp; Gordon, I. M. (2001). An examination of social and environmental reporting strategies. Accounting, Auditing &amp; Accountability Journal, 14(5), 587-617. </w:t>
       </w:r>
+      <w:hyperlink r:id="rId128" w:history="1">
+        <w:r>
+          <w:rPr>
+            <w:rStyle w:val="Hyperlink"/>
+            <w:rFonts w:ascii="Times New Roman" w:hAnsi="Times New Roman"/>
+            <w:color w:val="0563C1"/>
+            <w:u w:val="single"/>
+            <w:sz w:val="22"/>
+            <w:szCs w:val="22"/>
+          </w:rPr>
+          <w:t xml:space="preserve">https://doi.org/10.1108/EUM0000000006264</w:t>
+        </w:r>
+      </w:hyperlink>
     </w:p>
     <w:p>
       <w:pPr>
         <w:ind w:left="480" w:hanging="480"/>
+        <w:spacing w:after="80" w:line="276" w:lineRule="auto"/>
         <w:jc w:val="left"/>
-        <w:spacing w:after="80" w:line="276" w:lineRule="auto"/>
       </w:pPr>
       <w:r>
         <w:rPr>
           <w:sz w:val="22"/>
           <w:szCs w:val="22"/>
         </w:rPr>
-        <w:t xml:space="preserve">Deegan, C. (2002). Introducing the legitimising effect of social and environmental disclosures: A theoretical foundation. Accounting, Auditing &amp; Accountability Journal, 15(3), 282-311. https://doi.org/10.1108/09513570210435852</w:t>
+        <w:t xml:space="preserve">Deegan, C. (2002). Introducing the legitimising effect of social and environmental disclosures: A theoretical foundation. Accounting, Auditing &amp; Accountability Journal, 15(3), 282-311. </w:t>
       </w:r>
+      <w:hyperlink r:id="rId129" w:history="1">
+        <w:r>
+          <w:rPr>
+            <w:rStyle w:val="Hyperlink"/>
+            <w:rFonts w:ascii="Times New Roman" w:hAnsi="Times New Roman"/>
+            <w:color w:val="0563C1"/>
+            <w:u w:val="single"/>
+            <w:sz w:val="22"/>
+            <w:szCs w:val="22"/>
+          </w:rPr>
+          <w:t xml:space="preserve">https://doi.org/10.1108/09513570210435852</w:t>
+        </w:r>
+      </w:hyperlink>
     </w:p>
     <w:p>
       <w:pPr>
         <w:ind w:left="480" w:hanging="480"/>
+        <w:spacing w:after="80" w:line="276" w:lineRule="auto"/>
         <w:jc w:val="left"/>
-        <w:spacing w:after="80" w:line="276" w:lineRule="auto"/>
       </w:pPr>
       <w:r>
         <w:rPr>
           <w:sz w:val="22"/>
           <w:szCs w:val="22"/>
         </w:rPr>
-        <w:t xml:space="preserve">Delmas, M. A., &amp; Burbano, V. C. (2011). The drivers of greenwashing. California Management Review, 54(1), 64-87. https://doi.org/10.1525/cmr.2011.54.1.64</w:t>
+        <w:t xml:space="preserve">Delmas, M. A., &amp; Burbano, V. C. (2011). The drivers of greenwashing. California Management Review, 54(1), 64-87. </w:t>
       </w:r>
+      <w:hyperlink r:id="rId130" w:history="1">
+        <w:r>
+          <w:rPr>
+            <w:rStyle w:val="Hyperlink"/>
+            <w:rFonts w:ascii="Times New Roman" w:hAnsi="Times New Roman"/>
+            <w:color w:val="0563C1"/>
+            <w:u w:val="single"/>
+            <w:sz w:val="22"/>
+            <w:szCs w:val="22"/>
+          </w:rPr>
+          <w:t xml:space="preserve">https://doi.org/10.1525/cmr.2011.54.1.64</w:t>
+        </w:r>
+      </w:hyperlink>
     </w:p>
     <w:p>
       <w:pPr>
         <w:ind w:left="480" w:hanging="480"/>
+        <w:spacing w:after="80" w:line="276" w:lineRule="auto"/>
         <w:jc w:val="left"/>
-        <w:spacing w:after="80" w:line="276" w:lineRule="auto"/>
       </w:pPr>
       <w:r>
         <w:rPr>
           <w:sz w:val="22"/>
           <w:szCs w:val="22"/>
         </w:rPr>
-        <w:t xml:space="preserve">Dhaliwal, D. S., Li, O. Z., Tsang, A., &amp; Yang, Y. G. (2011). Voluntary nonfinancial disclosure and the cost of equity capital: The initiation of corporate social responsibility reporting. The Accounting Review, 86(1), 59-100. https://doi.org/10.2308/accr.00000005</w:t>
+        <w:t xml:space="preserve">Dhaliwal, D. S., Li, O. Z., Tsang, A., &amp; Yang, Y. G. (2011). Voluntary nonfinancial disclosure and the cost of equity capital: The initiation of corporate social responsibility reporting. The Accounting Review, 86(1), 59-100. </w:t>
       </w:r>
+      <w:hyperlink r:id="rId131" w:history="1">
+        <w:r>
+          <w:rPr>
+            <w:rStyle w:val="Hyperlink"/>
+            <w:rFonts w:ascii="Times New Roman" w:hAnsi="Times New Roman"/>
+            <w:color w:val="0563C1"/>
+            <w:u w:val="single"/>
+            <w:sz w:val="22"/>
+            <w:szCs w:val="22"/>
+          </w:rPr>
+          <w:t xml:space="preserve">https://doi.org/10.2308/accr.00000005</w:t>
+        </w:r>
+      </w:hyperlink>
     </w:p>
     <w:p>
       <w:pPr>
         <w:ind w:left="480" w:hanging="480"/>
+        <w:spacing w:after="80" w:line="276" w:lineRule="auto"/>
         <w:jc w:val="left"/>
-        <w:spacing w:after="80" w:line="276" w:lineRule="auto"/>
       </w:pPr>
       <w:r>
         <w:rPr>
           <w:sz w:val="22"/>
           <w:szCs w:val="22"/>
         </w:rPr>
-        <w:t xml:space="preserve">DiMaggio, P. J., &amp; Powell, W. W. (1983). The iron cage revisited: Institutional isomorphism and collective rationality in organizational fields. American Sociological Review, 48(2), 147-160. https://doi.org/10.2307/2095101</w:t>
+        <w:t xml:space="preserve">DiMaggio, P. J., &amp; Powell, W. W. (1983). The iron cage revisited: Institutional isomorphism and collective rationality in organizational fields. American Sociological Review, 48(2), 147-160. </w:t>
       </w:r>
+      <w:hyperlink r:id="rId132" w:history="1">
+        <w:r>
+          <w:rPr>
+            <w:rStyle w:val="Hyperlink"/>
+            <w:rFonts w:ascii="Times New Roman" w:hAnsi="Times New Roman"/>
+            <w:color w:val="0563C1"/>
+            <w:u w:val="single"/>
+            <w:sz w:val="22"/>
+            <w:szCs w:val="22"/>
+          </w:rPr>
+          <w:t xml:space="preserve">https://doi.org/10.2307/2095101</w:t>
+        </w:r>
+      </w:hyperlink>
     </w:p>
     <w:p>
       <w:pPr>
         <w:ind w:left="480" w:hanging="480"/>
+        <w:spacing w:after="80" w:line="276" w:lineRule="auto"/>
         <w:jc w:val="left"/>
-        <w:spacing w:after="80" w:line="276" w:lineRule="auto"/>
       </w:pPr>
       <w:r>
         <w:rPr>
           <w:sz w:val="22"/>
           <w:szCs w:val="22"/>
         </w:rPr>
-        <w:t xml:space="preserve">El Kalak, I., Goergen, M., &amp; Guney, Y. (2026). Legal heritage and corporate social responsibility. British Journal of Management. Advance online publication. https://doi.org/10.1111/1467-8551.70068</w:t>
+        <w:t xml:space="preserve">El Kalak, I., Goergen, M., &amp; Guney, Y. (2026). Legal heritage and corporate social responsibility. British Journal of Management. Advance online publication. </w:t>
       </w:r>
+      <w:hyperlink r:id="rId133" w:history="1">
+        <w:r>
+          <w:rPr>
+            <w:rStyle w:val="Hyperlink"/>
+            <w:rFonts w:ascii="Times New Roman" w:hAnsi="Times New Roman"/>
+            <w:color w:val="0563C1"/>
+            <w:u w:val="single"/>
+            <w:sz w:val="22"/>
+            <w:szCs w:val="22"/>
+          </w:rPr>
+          <w:t xml:space="preserve">https://doi.org/10.1111/1467-8551.70068</w:t>
+        </w:r>
+      </w:hyperlink>
     </w:p>
     <w:p>
       <w:pPr>
         <w:ind w:left="480" w:hanging="480"/>
+        <w:spacing w:after="80" w:line="276" w:lineRule="auto"/>
         <w:jc w:val="left"/>
-        <w:spacing w:after="80" w:line="276" w:lineRule="auto"/>
       </w:pPr>
       <w:r>
         <w:rPr>
           <w:sz w:val="22"/>
           <w:szCs w:val="22"/>
         </w:rPr>
-        <w:t xml:space="preserve">Eliwa, Y., Aboud, A., &amp; Saleh, A. (2023). Board gender diversity and ESG decoupling: Does religiosity matter? Business Strategy and the Environment, 32(7), 4046-4067. https://doi.org/10.1002/bse.3353</w:t>
+        <w:t xml:space="preserve">Eliwa, Y., Aboud, A., &amp; Saleh, A. (2023). Board gender diversity and ESG decoupling: Does religiosity matter? Business Strategy and the Environment, 32(7), 4046-4067. </w:t>
       </w:r>
+      <w:hyperlink r:id="rId134" w:history="1">
+        <w:r>
+          <w:rPr>
+            <w:rStyle w:val="Hyperlink"/>
+            <w:rFonts w:ascii="Times New Roman" w:hAnsi="Times New Roman"/>
+            <w:color w:val="0563C1"/>
+            <w:u w:val="single"/>
+            <w:sz w:val="22"/>
+            <w:szCs w:val="22"/>
+          </w:rPr>
+          <w:t xml:space="preserve">https://doi.org/10.1002/bse.3353</w:t>
+        </w:r>
+      </w:hyperlink>
     </w:p>
     <w:p>
       <w:pPr>
         <w:ind w:left="480" w:hanging="480"/>
+        <w:spacing w:after="80" w:line="276" w:lineRule="auto"/>
         <w:jc w:val="left"/>
-        <w:spacing w:after="80" w:line="276" w:lineRule="auto"/>
       </w:pPr>
       <w:r>
         <w:rPr>
           <w:sz w:val="22"/>
           <w:szCs w:val="22"/>
         </w:rPr>
-        <w:t xml:space="preserve">Fan, X., Shen, X., Wang, D., &amp; Zhou, C. (2025). The Paris Agreement and firms’ carbon information disclosure: Honesty or catering? International Review of Economics &amp; Finance, 99, 103884. https://doi.org/10.1016/j.iref.2025.103988</w:t>
+        <w:t xml:space="preserve">Fan, X., Shen, X., Wang, D., &amp; Zhou, C. (2025). The Paris Agreement and firms’ carbon information disclosure: Honesty or catering? International Review of Economics &amp; Finance, 99, 103884. </w:t>
       </w:r>
+      <w:hyperlink r:id="rId135" w:history="1">
+        <w:r>
+          <w:rPr>
+            <w:rStyle w:val="Hyperlink"/>
+            <w:rFonts w:ascii="Times New Roman" w:hAnsi="Times New Roman"/>
+            <w:color w:val="0563C1"/>
+            <w:u w:val="single"/>
+            <w:sz w:val="22"/>
+            <w:szCs w:val="22"/>
+          </w:rPr>
+          <w:t xml:space="preserve">https://doi.org/10.1016/j.iref.2025.103988</w:t>
+        </w:r>
+      </w:hyperlink>
     </w:p>
     <w:p>
       <w:pPr>
         <w:ind w:left="480" w:hanging="480"/>
+        <w:spacing w:after="80" w:line="276" w:lineRule="auto"/>
         <w:jc w:val="left"/>
-        <w:spacing w:after="80" w:line="276" w:lineRule="auto"/>
       </w:pPr>
       <w:r>
         <w:rPr>
           <w:sz w:val="22"/>
           <w:szCs w:val="22"/>
         </w:rPr>
-        <w:t xml:space="preserve">Flammer, C. (2013). Corporate social responsibility and shareholder reaction: The environmental awareness of investors. Academy of Management Journal, 56(3), 758-781. https://doi.org/10.5465/amj.2011.0744</w:t>
+        <w:t xml:space="preserve">Flammer, C. (2013). Corporate social responsibility and shareholder reaction: The environmental awareness of investors. Academy of Management Journal, 56(3), 758-781. </w:t>
       </w:r>
+      <w:hyperlink r:id="rId136" w:history="1">
+        <w:r>
+          <w:rPr>
+            <w:rStyle w:val="Hyperlink"/>
+            <w:rFonts w:ascii="Times New Roman" w:hAnsi="Times New Roman"/>
+            <w:color w:val="0563C1"/>
+            <w:u w:val="single"/>
+            <w:sz w:val="22"/>
+            <w:szCs w:val="22"/>
+          </w:rPr>
+          <w:t xml:space="preserve">https://doi.org/10.5465/amj.2011.0744</w:t>
+        </w:r>
+      </w:hyperlink>
     </w:p>
     <w:p>
       <w:pPr>
         <w:ind w:left="480" w:hanging="480"/>
+        <w:spacing w:after="80" w:line="276" w:lineRule="auto"/>
         <w:jc w:val="left"/>
-        <w:spacing w:after="80" w:line="276" w:lineRule="auto"/>
       </w:pPr>
       <w:r>
         <w:rPr>
           <w:sz w:val="22"/>
           <w:szCs w:val="22"/>
         </w:rPr>
-        <w:t xml:space="preserve">Flammer, C. (2021). Corporate green bonds. Journal of Financial Economics, 142(2), 499-516. https://doi.org/10.1016/j.jfineco.2021.01.010</w:t>
+        <w:t xml:space="preserve">Flammer, C. (2021). Corporate green bonds. Journal of Financial Economics, 142(2), 499-516. </w:t>
       </w:r>
+      <w:hyperlink r:id="rId137" w:history="1">
+        <w:r>
+          <w:rPr>
+            <w:rStyle w:val="Hyperlink"/>
+            <w:rFonts w:ascii="Times New Roman" w:hAnsi="Times New Roman"/>
+            <w:color w:val="0563C1"/>
+            <w:u w:val="single"/>
+            <w:sz w:val="22"/>
+            <w:szCs w:val="22"/>
+          </w:rPr>
+          <w:t xml:space="preserve">https://doi.org/10.1016/j.jfineco.2021.01.010</w:t>
+        </w:r>
+      </w:hyperlink>
     </w:p>
     <w:p>
       <w:pPr>
         <w:ind w:left="480" w:hanging="480"/>
+        <w:spacing w:after="80" w:line="276" w:lineRule="auto"/>
         <w:jc w:val="left"/>
-        <w:spacing w:after="80" w:line="276" w:lineRule="auto"/>
       </w:pPr>
       <w:r>
         <w:rPr>
           <w:sz w:val="22"/>
           <w:szCs w:val="22"/>
         </w:rPr>
-        <w:t xml:space="preserve">Gibson Brandon, R., Krueger, P., &amp; Schmidt, P. S. (2021). ESG rating disagreement and stock returns. Financial Analysts Journal, 77(4), 104-127. https://doi.org/10.1080/0015198X.2021.1963186</w:t>
+        <w:t xml:space="preserve">Gibson Brandon, R., Krueger, P., &amp; Schmidt, P. S. (2021). ESG rating disagreement and stock returns. Financial Analysts Journal, 77(4), 104-127. </w:t>
       </w:r>
+      <w:hyperlink r:id="rId138" w:history="1">
+        <w:r>
+          <w:rPr>
+            <w:rStyle w:val="Hyperlink"/>
+            <w:rFonts w:ascii="Times New Roman" w:hAnsi="Times New Roman"/>
+            <w:color w:val="0563C1"/>
+            <w:u w:val="single"/>
+            <w:sz w:val="22"/>
+            <w:szCs w:val="22"/>
+          </w:rPr>
+          <w:t xml:space="preserve">https://doi.org/10.1080/0015198X.2021.1963186</w:t>
+        </w:r>
+      </w:hyperlink>
     </w:p>
     <w:p>
       <w:pPr>
         <w:ind w:left="480" w:hanging="480"/>
+        <w:spacing w:after="80" w:line="276" w:lineRule="auto"/>
         <w:jc w:val="left"/>
-        <w:spacing w:after="80" w:line="276" w:lineRule="auto"/>
       </w:pPr>
       <w:r>
         <w:rPr>
           <w:sz w:val="22"/>
           <w:szCs w:val="22"/>
         </w:rPr>
-        <w:t xml:space="preserve">Hahn, R., &amp; Lülfs, R. (2014). Legitimizing negative aspects in GRI-oriented sustainability reporting: A qualitative analysis of corporate disclosure strategies. Journal of Business Ethics, 123(3), 401-420. https://doi.org/10.1007/s10551-013-1801-4</w:t>
+        <w:t xml:space="preserve">Hahn, R., &amp; Lülfs, R. (2014). Legitimizing negative aspects in GRI-oriented sustainability reporting: A qualitative analysis of corporate disclosure strategies. Journal of Business Ethics, 123(3), 401-420. </w:t>
       </w:r>
+      <w:hyperlink r:id="rId139" w:history="1">
+        <w:r>
+          <w:rPr>
+            <w:rStyle w:val="Hyperlink"/>
+            <w:rFonts w:ascii="Times New Roman" w:hAnsi="Times New Roman"/>
+            <w:color w:val="0563C1"/>
+            <w:u w:val="single"/>
+            <w:sz w:val="22"/>
+            <w:szCs w:val="22"/>
+          </w:rPr>
+          <w:t xml:space="preserve">https://doi.org/10.1007/s10551-013-1801-4</w:t>
+        </w:r>
+      </w:hyperlink>
     </w:p>
     <w:p>
       <w:pPr>
         <w:ind w:left="480" w:hanging="480"/>
+        <w:spacing w:after="80" w:line="276" w:lineRule="auto"/>
         <w:jc w:val="left"/>
-        <w:spacing w:after="80" w:line="276" w:lineRule="auto"/>
       </w:pPr>
       <w:r>
         <w:rPr>
@@ -23313,386 +23833,737 @@
     <w:p>
       <w:pPr>
         <w:ind w:left="480" w:hanging="480"/>
+        <w:spacing w:after="80" w:line="276" w:lineRule="auto"/>
         <w:jc w:val="left"/>
-        <w:spacing w:after="80" w:line="276" w:lineRule="auto"/>
       </w:pPr>
       <w:r>
         <w:rPr>
           <w:sz w:val="22"/>
           <w:szCs w:val="22"/>
         </w:rPr>
-        <w:t xml:space="preserve">Hawn, O., &amp; Ioannou, I. (2016). Mind the gap: The interplay between external and internal actions in the case of corporate social responsibility. Strategic Management Journal, 37(13), 2569-2588. https://doi.org/10.1002/smj.2464</w:t>
+        <w:t xml:space="preserve">Hawn, O., &amp; Ioannou, I. (2016). Mind the gap: The interplay between external and internal actions in the case of corporate social responsibility. Strategic Management Journal, 37(13), 2569-2588. </w:t>
       </w:r>
+      <w:hyperlink r:id="rId140" w:history="1">
+        <w:r>
+          <w:rPr>
+            <w:rStyle w:val="Hyperlink"/>
+            <w:rFonts w:ascii="Times New Roman" w:hAnsi="Times New Roman"/>
+            <w:color w:val="0563C1"/>
+            <w:u w:val="single"/>
+            <w:sz w:val="22"/>
+            <w:szCs w:val="22"/>
+          </w:rPr>
+          <w:t xml:space="preserve">https://doi.org/10.1002/smj.2464</w:t>
+        </w:r>
+      </w:hyperlink>
     </w:p>
     <w:p>
       <w:pPr>
         <w:ind w:left="480" w:hanging="480"/>
+        <w:spacing w:after="80" w:line="276" w:lineRule="auto"/>
         <w:jc w:val="left"/>
-        <w:spacing w:after="80" w:line="276" w:lineRule="auto"/>
       </w:pPr>
       <w:r>
         <w:rPr>
           <w:sz w:val="22"/>
           <w:szCs w:val="22"/>
         </w:rPr>
-        <w:t xml:space="preserve">Hummel, K., &amp; Schlick, C. (2016). The relationship between sustainability performance and sustainability disclosure: Reconciling voluntary disclosure theory and legitimacy theory. Journal of Accounting and Public Policy, 35(5), 455-476. https://doi.org/10.1016/j.jaccpubpol.2016.06.001</w:t>
+        <w:t xml:space="preserve">Hummel, K., &amp; Schlick, C. (2016). The relationship between sustainability performance and sustainability disclosure: Reconciling voluntary disclosure theory and legitimacy theory. Journal of Accounting and Public Policy, 35(5), 455-476. </w:t>
       </w:r>
+      <w:hyperlink r:id="rId141" w:history="1">
+        <w:r>
+          <w:rPr>
+            <w:rStyle w:val="Hyperlink"/>
+            <w:rFonts w:ascii="Times New Roman" w:hAnsi="Times New Roman"/>
+            <w:color w:val="0563C1"/>
+            <w:u w:val="single"/>
+            <w:sz w:val="22"/>
+            <w:szCs w:val="22"/>
+          </w:rPr>
+          <w:t xml:space="preserve">https://doi.org/10.1016/j.jaccpubpol.2016.06.001</w:t>
+        </w:r>
+      </w:hyperlink>
     </w:p>
     <w:p>
       <w:pPr>
         <w:ind w:left="480" w:hanging="480"/>
+        <w:spacing w:after="80" w:line="276" w:lineRule="auto"/>
         <w:jc w:val="left"/>
-        <w:spacing w:after="80" w:line="276" w:lineRule="auto"/>
       </w:pPr>
       <w:r>
         <w:rPr>
           <w:sz w:val="22"/>
           <w:szCs w:val="22"/>
         </w:rPr>
-        <w:t xml:space="preserve">Jaffe, A. B., &amp; Palmer, K. (1997). Environmental regulation and innovation: A panel data study. Review of Economics and Statistics, 79(4), 610-619. https://doi.org/10.1162/003465397557196</w:t>
+        <w:t xml:space="preserve">Jaffe, A. B., &amp; Palmer, K. (1997). Environmental regulation and innovation: A panel data study. Review of Economics and Statistics, 79(4), 610-619. </w:t>
       </w:r>
+      <w:hyperlink r:id="rId142" w:history="1">
+        <w:r>
+          <w:rPr>
+            <w:rStyle w:val="Hyperlink"/>
+            <w:rFonts w:ascii="Times New Roman" w:hAnsi="Times New Roman"/>
+            <w:color w:val="0563C1"/>
+            <w:u w:val="single"/>
+            <w:sz w:val="22"/>
+            <w:szCs w:val="22"/>
+          </w:rPr>
+          <w:t xml:space="preserve">https://doi.org/10.1162/003465397557196</w:t>
+        </w:r>
+      </w:hyperlink>
     </w:p>
     <w:p>
       <w:pPr>
         <w:ind w:left="480" w:hanging="480"/>
+        <w:spacing w:after="80" w:line="276" w:lineRule="auto"/>
         <w:jc w:val="left"/>
-        <w:spacing w:after="80" w:line="276" w:lineRule="auto"/>
       </w:pPr>
       <w:r>
         <w:rPr>
           <w:sz w:val="22"/>
           <w:szCs w:val="22"/>
         </w:rPr>
-        <w:t xml:space="preserve">Kaufmann, D., Kraay, A., &amp; Mastruzzi, M. (2011). The Worldwide Governance Indicators: Methodology and analytical issues. Hague Journal on the Rule of Law, 3(2), 220-246. https://doi.org/10.1017/S1876404511200046</w:t>
+        <w:t xml:space="preserve">Kaufmann, D., Kraay, A., &amp; Mastruzzi, M. (2011). The Worldwide Governance Indicators: Methodology and analytical issues. Hague Journal on the Rule of Law, 3(2), 220-246. </w:t>
       </w:r>
+      <w:hyperlink r:id="rId143" w:history="1">
+        <w:r>
+          <w:rPr>
+            <w:rStyle w:val="Hyperlink"/>
+            <w:rFonts w:ascii="Times New Roman" w:hAnsi="Times New Roman"/>
+            <w:color w:val="0563C1"/>
+            <w:u w:val="single"/>
+            <w:sz w:val="22"/>
+            <w:szCs w:val="22"/>
+          </w:rPr>
+          <w:t xml:space="preserve">https://doi.org/10.1017/S1876404511200046</w:t>
+        </w:r>
+      </w:hyperlink>
     </w:p>
     <w:p>
       <w:pPr>
         <w:ind w:left="480" w:hanging="480"/>
+        <w:spacing w:after="80" w:line="276" w:lineRule="auto"/>
         <w:jc w:val="left"/>
-        <w:spacing w:after="80" w:line="276" w:lineRule="auto"/>
       </w:pPr>
       <w:r>
         <w:rPr>
           <w:sz w:val="22"/>
           <w:szCs w:val="22"/>
         </w:rPr>
-        <w:t xml:space="preserve">Kercher, K., Duncan, K., Moore, G., &amp; Southam, C. (2026). Global state of play for extended sustainability disclosures, performance, and assurance: Insights from cross-country benchmarking. Accounting &amp; Finance, 66, 824-848. https://doi.org/10.1111/acfi.70185</w:t>
+        <w:t xml:space="preserve">Kercher, K., Duncan, K., Moore, G., &amp; Southam, C. (2026). Global state of play for extended sustainability disclosures, performance, and assurance: Insights from cross-country benchmarking. Accounting &amp; Finance, 66, 824-848. </w:t>
       </w:r>
+      <w:hyperlink r:id="rId144" w:history="1">
+        <w:r>
+          <w:rPr>
+            <w:rStyle w:val="Hyperlink"/>
+            <w:rFonts w:ascii="Times New Roman" w:hAnsi="Times New Roman"/>
+            <w:color w:val="0563C1"/>
+            <w:u w:val="single"/>
+            <w:sz w:val="22"/>
+            <w:szCs w:val="22"/>
+          </w:rPr>
+          <w:t xml:space="preserve">https://doi.org/10.1111/acfi.70185</w:t>
+        </w:r>
+      </w:hyperlink>
     </w:p>
     <w:p>
       <w:pPr>
         <w:ind w:left="480" w:hanging="480"/>
+        <w:spacing w:after="80" w:line="276" w:lineRule="auto"/>
         <w:jc w:val="left"/>
-        <w:spacing w:after="80" w:line="276" w:lineRule="auto"/>
       </w:pPr>
       <w:r>
         <w:rPr>
           <w:sz w:val="22"/>
           <w:szCs w:val="22"/>
         </w:rPr>
-        <w:t xml:space="preserve">Keresztúri, J. L., Berlinger, E., &amp; Lublóy, Á. (2025). Environmental policy and stakeholder engagement: Incident-based, cross-country analysis of firm-level greenwashing practices. Corporate Social Responsibility and Environmental Management, 32(1), 192-211. https://doi.org/10.1002/csr.2945</w:t>
+        <w:t xml:space="preserve">Keresztúri, J. L., Berlinger, E., &amp; Lublóy, Á. (2025). Environmental policy and stakeholder engagement: Incident-based, cross-country analysis of firm-level greenwashing practices. Corporate Social Responsibility and Environmental Management, 32(1), 192-211. </w:t>
       </w:r>
+      <w:hyperlink r:id="rId145" w:history="1">
+        <w:r>
+          <w:rPr>
+            <w:rStyle w:val="Hyperlink"/>
+            <w:rFonts w:ascii="Times New Roman" w:hAnsi="Times New Roman"/>
+            <w:color w:val="0563C1"/>
+            <w:u w:val="single"/>
+            <w:sz w:val="22"/>
+            <w:szCs w:val="22"/>
+          </w:rPr>
+          <w:t xml:space="preserve">https://doi.org/10.1002/csr.2945</w:t>
+        </w:r>
+      </w:hyperlink>
     </w:p>
     <w:p>
       <w:pPr>
         <w:ind w:left="480" w:hanging="480"/>
+        <w:spacing w:after="80" w:line="276" w:lineRule="auto"/>
         <w:jc w:val="left"/>
-        <w:spacing w:after="80" w:line="276" w:lineRule="auto"/>
       </w:pPr>
       <w:r>
         <w:rPr>
           <w:sz w:val="22"/>
           <w:szCs w:val="22"/>
         </w:rPr>
-        <w:t xml:space="preserve">Kim, E. H., &amp; Lyon, T. P. (2015). Greenwash vs. brownwash: Exaggeration and undue modesty in corporate sustainability disclosure. Organization Science, 26(3), 705-723. https://doi.org/10.1287/orsc.2014.0949</w:t>
+        <w:t xml:space="preserve">Kim, E. H., &amp; Lyon, T. P. (2015). Greenwash vs. brownwash: Exaggeration and undue modesty in corporate sustainability disclosure. Organization Science, 26(3), 705-723. </w:t>
       </w:r>
+      <w:hyperlink r:id="rId146" w:history="1">
+        <w:r>
+          <w:rPr>
+            <w:rStyle w:val="Hyperlink"/>
+            <w:rFonts w:ascii="Times New Roman" w:hAnsi="Times New Roman"/>
+            <w:color w:val="0563C1"/>
+            <w:u w:val="single"/>
+            <w:sz w:val="22"/>
+            <w:szCs w:val="22"/>
+          </w:rPr>
+          <w:t xml:space="preserve">https://doi.org/10.1287/orsc.2014.0949</w:t>
+        </w:r>
+      </w:hyperlink>
     </w:p>
     <w:p>
       <w:pPr>
         <w:ind w:left="480" w:hanging="480"/>
+        <w:spacing w:after="80" w:line="276" w:lineRule="auto"/>
         <w:jc w:val="left"/>
-        <w:spacing w:after="80" w:line="276" w:lineRule="auto"/>
       </w:pPr>
       <w:r>
         <w:rPr>
           <w:sz w:val="22"/>
           <w:szCs w:val="22"/>
         </w:rPr>
-        <w:t xml:space="preserve">Krueger, P., Sautner, Z., &amp; Starks, L. T. (2020). The importance of climate risks for institutional investors. Review of Financial Studies, 33(3), 1067-1111. https://doi.org/10.1093/rfs/hhz137</w:t>
+        <w:t xml:space="preserve">Krueger, P., Sautner, Z., &amp; Starks, L. T. (2020). The importance of climate risks for institutional investors. Review of Financial Studies, 33(3), 1067-1111. </w:t>
       </w:r>
+      <w:hyperlink r:id="rId147" w:history="1">
+        <w:r>
+          <w:rPr>
+            <w:rStyle w:val="Hyperlink"/>
+            <w:rFonts w:ascii="Times New Roman" w:hAnsi="Times New Roman"/>
+            <w:color w:val="0563C1"/>
+            <w:u w:val="single"/>
+            <w:sz w:val="22"/>
+            <w:szCs w:val="22"/>
+          </w:rPr>
+          <w:t xml:space="preserve">https://doi.org/10.1093/rfs/hhz137</w:t>
+        </w:r>
+      </w:hyperlink>
     </w:p>
     <w:p>
       <w:pPr>
         <w:ind w:left="480" w:hanging="480"/>
+        <w:spacing w:after="80" w:line="276" w:lineRule="auto"/>
         <w:jc w:val="left"/>
-        <w:spacing w:after="80" w:line="276" w:lineRule="auto"/>
       </w:pPr>
       <w:r>
         <w:rPr>
           <w:sz w:val="22"/>
           <w:szCs w:val="22"/>
         </w:rPr>
-        <w:t xml:space="preserve">La Porta, R., Lopez-de-Silanes, F., &amp; Shleifer, A. (2008). The economic consequences of legal origins. Journal of Economic Literature, 46(2), 285-332. https://doi.org/10.1257/jel.46.2.285</w:t>
+        <w:t xml:space="preserve">La Porta, R., Lopez-de-Silanes, F., &amp; Shleifer, A. (2008). The economic consequences of legal origins. Journal of Economic Literature, 46(2), 285-332. </w:t>
       </w:r>
+      <w:hyperlink r:id="rId148" w:history="1">
+        <w:r>
+          <w:rPr>
+            <w:rStyle w:val="Hyperlink"/>
+            <w:rFonts w:ascii="Times New Roman" w:hAnsi="Times New Roman"/>
+            <w:color w:val="0563C1"/>
+            <w:u w:val="single"/>
+            <w:sz w:val="22"/>
+            <w:szCs w:val="22"/>
+          </w:rPr>
+          <w:t xml:space="preserve">https://doi.org/10.1257/jel.46.2.285</w:t>
+        </w:r>
+      </w:hyperlink>
     </w:p>
     <w:p>
       <w:pPr>
         <w:ind w:left="480" w:hanging="480"/>
+        <w:spacing w:after="80" w:line="276" w:lineRule="auto"/>
         <w:jc w:val="left"/>
-        <w:spacing w:after="80" w:line="276" w:lineRule="auto"/>
       </w:pPr>
       <w:r>
         <w:rPr>
           <w:sz w:val="22"/>
           <w:szCs w:val="22"/>
         </w:rPr>
-        <w:t xml:space="preserve">Liang, H., &amp; Renneboog, L. (2017). On the foundations of corporate social responsibility. Journal of Finance, 72(2), 853-910. https://doi.org/10.1111/jofi.12487</w:t>
+        <w:t xml:space="preserve">Liang, H., &amp; Renneboog, L. (2017). On the foundations of corporate social responsibility. Journal of Finance, 72(2), 853-910. </w:t>
       </w:r>
+      <w:hyperlink r:id="rId149" w:history="1">
+        <w:r>
+          <w:rPr>
+            <w:rStyle w:val="Hyperlink"/>
+            <w:rFonts w:ascii="Times New Roman" w:hAnsi="Times New Roman"/>
+            <w:color w:val="0563C1"/>
+            <w:u w:val="single"/>
+            <w:sz w:val="22"/>
+            <w:szCs w:val="22"/>
+          </w:rPr>
+          <w:t xml:space="preserve">https://doi.org/10.1111/jofi.12487</w:t>
+        </w:r>
+      </w:hyperlink>
     </w:p>
     <w:p>
       <w:pPr>
         <w:ind w:left="480" w:hanging="480"/>
+        <w:spacing w:after="80" w:line="276" w:lineRule="auto"/>
         <w:jc w:val="left"/>
-        <w:spacing w:after="80" w:line="276" w:lineRule="auto"/>
       </w:pPr>
       <w:r>
         <w:rPr>
           <w:sz w:val="22"/>
           <w:szCs w:val="22"/>
         </w:rPr>
-        <w:t xml:space="preserve">Lu, J., &amp; Wang, J. (2021). Corporate governance, law, culture, environmental performance and CSR disclosure: A global perspective. Journal of International Financial Markets, Institutions and Money, 70, 101264. https://doi.org/10.1016/j.intfin.2020.101264</w:t>
+        <w:t xml:space="preserve">Lu, J., &amp; Wang, J. (2021). Corporate governance, law, culture, environmental performance and CSR disclosure: A global perspective. Journal of International Financial Markets, Institutions and Money, 70, 101264. </w:t>
       </w:r>
+      <w:hyperlink r:id="rId150" w:history="1">
+        <w:r>
+          <w:rPr>
+            <w:rStyle w:val="Hyperlink"/>
+            <w:rFonts w:ascii="Times New Roman" w:hAnsi="Times New Roman"/>
+            <w:color w:val="0563C1"/>
+            <w:u w:val="single"/>
+            <w:sz w:val="22"/>
+            <w:szCs w:val="22"/>
+          </w:rPr>
+          <w:t xml:space="preserve">https://doi.org/10.1016/j.intfin.2020.101264</w:t>
+        </w:r>
+      </w:hyperlink>
     </w:p>
     <w:p>
       <w:pPr>
         <w:ind w:left="480" w:hanging="480"/>
+        <w:spacing w:after="80" w:line="276" w:lineRule="auto"/>
         <w:jc w:val="left"/>
-        <w:spacing w:after="80" w:line="276" w:lineRule="auto"/>
       </w:pPr>
       <w:r>
         <w:rPr>
           <w:sz w:val="22"/>
           <w:szCs w:val="22"/>
         </w:rPr>
-        <w:t xml:space="preserve">Lyon, T. P., &amp; Maxwell, J. W. (2011). Greenwash: Corporate environmental disclosure under threat of audit. Journal of Economics &amp; Management Strategy, 20(1), 3-41. https://doi.org/10.1111/j.1530-9134.2010.00282.x</w:t>
+        <w:t xml:space="preserve">Lyon, T. P., &amp; Maxwell, J. W. (2011). Greenwash: Corporate environmental disclosure under threat of audit. Journal of Economics &amp; Management Strategy, 20(1), 3-41. </w:t>
       </w:r>
+      <w:hyperlink r:id="rId151" w:history="1">
+        <w:r>
+          <w:rPr>
+            <w:rStyle w:val="Hyperlink"/>
+            <w:rFonts w:ascii="Times New Roman" w:hAnsi="Times New Roman"/>
+            <w:color w:val="0563C1"/>
+            <w:u w:val="single"/>
+            <w:sz w:val="22"/>
+            <w:szCs w:val="22"/>
+          </w:rPr>
+          <w:t xml:space="preserve">https://doi.org/10.1111/j.1530-9134.2010.00282.x</w:t>
+        </w:r>
+      </w:hyperlink>
     </w:p>
     <w:p>
       <w:pPr>
         <w:ind w:left="480" w:hanging="480"/>
+        <w:spacing w:after="80" w:line="276" w:lineRule="auto"/>
         <w:jc w:val="left"/>
-        <w:spacing w:after="80" w:line="276" w:lineRule="auto"/>
       </w:pPr>
       <w:r>
         <w:rPr>
           <w:sz w:val="22"/>
           <w:szCs w:val="22"/>
         </w:rPr>
-        <w:t xml:space="preserve">Lyon, T. P., &amp; Montgomery, A. W. (2015). The means and end of greenwash. Organization &amp; Environment, 28(2), 223-249. https://doi.org/10.1177/1086026615575332</w:t>
+        <w:t xml:space="preserve">Lyon, T. P., &amp; Montgomery, A. W. (2015). The means and end of greenwash. Organization &amp; Environment, 28(2), 223-249. </w:t>
       </w:r>
+      <w:hyperlink r:id="rId152" w:history="1">
+        <w:r>
+          <w:rPr>
+            <w:rStyle w:val="Hyperlink"/>
+            <w:rFonts w:ascii="Times New Roman" w:hAnsi="Times New Roman"/>
+            <w:color w:val="0563C1"/>
+            <w:u w:val="single"/>
+            <w:sz w:val="22"/>
+            <w:szCs w:val="22"/>
+          </w:rPr>
+          <w:t xml:space="preserve">https://doi.org/10.1177/1086026615575332</w:t>
+        </w:r>
+      </w:hyperlink>
     </w:p>
     <w:p>
       <w:pPr>
         <w:ind w:left="480" w:hanging="480"/>
+        <w:spacing w:after="80" w:line="276" w:lineRule="auto"/>
         <w:jc w:val="left"/>
-        <w:spacing w:after="80" w:line="276" w:lineRule="auto"/>
       </w:pPr>
       <w:r>
         <w:rPr>
           <w:sz w:val="22"/>
           <w:szCs w:val="22"/>
         </w:rPr>
-        <w:t xml:space="preserve">Makeeva, E., Popov, K., &amp; Teplova, O. (2024). Patenting for profitability: Green energy innovations and firm performance in BRICS countries. Frontiers in Environmental Science, 12, 1332792. https://doi.org/10.3389/fenvs.2024.1332792</w:t>
+        <w:t xml:space="preserve">Makeeva, E., Popov, K., &amp; Teplova, O. (2024). Patenting for profitability: Green energy innovations and firm performance in BRICS countries. Frontiers in Environmental Science, 12, 1332792. </w:t>
       </w:r>
+      <w:hyperlink r:id="rId153" w:history="1">
+        <w:r>
+          <w:rPr>
+            <w:rStyle w:val="Hyperlink"/>
+            <w:rFonts w:ascii="Times New Roman" w:hAnsi="Times New Roman"/>
+            <w:color w:val="0563C1"/>
+            <w:u w:val="single"/>
+            <w:sz w:val="22"/>
+            <w:szCs w:val="22"/>
+          </w:rPr>
+          <w:t xml:space="preserve">https://doi.org/10.3389/fenvs.2024.1332792</w:t>
+        </w:r>
+      </w:hyperlink>
     </w:p>
     <w:p>
       <w:pPr>
         <w:ind w:left="480" w:hanging="480"/>
+        <w:spacing w:after="80" w:line="276" w:lineRule="auto"/>
         <w:jc w:val="left"/>
-        <w:spacing w:after="80" w:line="276" w:lineRule="auto"/>
       </w:pPr>
       <w:r>
         <w:rPr>
           <w:sz w:val="22"/>
           <w:szCs w:val="22"/>
         </w:rPr>
-        <w:t xml:space="preserve">Manes-Rossi, F., &amp; Nicolò, G. (2022). Exploring sustainable development goals reporting practices: From symbolic to substantive approaches: Evidence from the energy sector. Corporate Social Responsibility and Environmental Management, 29(5), 1799-1815. https://doi.org/10.1002/csr.2328</w:t>
+        <w:t xml:space="preserve">Manes-Rossi, F., &amp; Nicolò, G. (2022). Exploring sustainable development goals reporting practices: From symbolic to substantive approaches: Evidence from the energy sector. Corporate Social Responsibility and Environmental Management, 29(5), 1799-1815. </w:t>
       </w:r>
+      <w:hyperlink r:id="rId154" w:history="1">
+        <w:r>
+          <w:rPr>
+            <w:rStyle w:val="Hyperlink"/>
+            <w:rFonts w:ascii="Times New Roman" w:hAnsi="Times New Roman"/>
+            <w:color w:val="0563C1"/>
+            <w:u w:val="single"/>
+            <w:sz w:val="22"/>
+            <w:szCs w:val="22"/>
+          </w:rPr>
+          <w:t xml:space="preserve">https://doi.org/10.1002/csr.2328</w:t>
+        </w:r>
+      </w:hyperlink>
     </w:p>
     <w:p>
       <w:pPr>
         <w:ind w:left="480" w:hanging="480"/>
+        <w:spacing w:after="80" w:line="276" w:lineRule="auto"/>
         <w:jc w:val="left"/>
-        <w:spacing w:after="80" w:line="276" w:lineRule="auto"/>
       </w:pPr>
       <w:r>
         <w:rPr>
           <w:sz w:val="22"/>
           <w:szCs w:val="22"/>
         </w:rPr>
-        <w:t xml:space="preserve">Manya, D., Campbell, M., &amp; Smith, R. (2026). Red flags in green promises: A framework for identifying greenwashing risk in corporate climate pledges. npj Climate Action, 5(1), 19. https://doi.org/10.1038/s44168-026-00346-6</w:t>
+        <w:t xml:space="preserve">Manya, D., Campbell, M., &amp; Smith, R. (2026). Red flags in green promises: A framework for identifying greenwashing risk in corporate climate pledges. npj Climate Action, 5(1), 19. </w:t>
       </w:r>
+      <w:hyperlink r:id="rId155" w:history="1">
+        <w:r>
+          <w:rPr>
+            <w:rStyle w:val="Hyperlink"/>
+            <w:rFonts w:ascii="Times New Roman" w:hAnsi="Times New Roman"/>
+            <w:color w:val="0563C1"/>
+            <w:u w:val="single"/>
+            <w:sz w:val="22"/>
+            <w:szCs w:val="22"/>
+          </w:rPr>
+          <w:t xml:space="preserve">https://doi.org/10.1038/s44168-026-00346-6</w:t>
+        </w:r>
+      </w:hyperlink>
     </w:p>
     <w:p>
       <w:pPr>
         <w:ind w:left="480" w:hanging="480"/>
+        <w:spacing w:after="80" w:line="276" w:lineRule="auto"/>
         <w:jc w:val="left"/>
-        <w:spacing w:after="80" w:line="276" w:lineRule="auto"/>
       </w:pPr>
       <w:r>
         <w:rPr>
           <w:sz w:val="22"/>
           <w:szCs w:val="22"/>
         </w:rPr>
-        <w:t xml:space="preserve">Marquis, C., Toffel, M. W., &amp; Zhou, Y. (2016). Scrutiny, norms, and selective disclosure: A global study of greenwashing. Organization Science, 27(2), 483-504. https://doi.org/10.1287/orsc.2015.1039</w:t>
+        <w:t xml:space="preserve">Marquis, C., Toffel, M. W., &amp; Zhou, Y. (2016). Scrutiny, norms, and selective disclosure: A global study of greenwashing. Organization Science, 27(2), 483-504. </w:t>
       </w:r>
+      <w:hyperlink r:id="rId156" w:history="1">
+        <w:r>
+          <w:rPr>
+            <w:rStyle w:val="Hyperlink"/>
+            <w:rFonts w:ascii="Times New Roman" w:hAnsi="Times New Roman"/>
+            <w:color w:val="0563C1"/>
+            <w:u w:val="single"/>
+            <w:sz w:val="22"/>
+            <w:szCs w:val="22"/>
+          </w:rPr>
+          <w:t xml:space="preserve">https://doi.org/10.1287/orsc.2015.1039</w:t>
+        </w:r>
+      </w:hyperlink>
     </w:p>
     <w:p>
       <w:pPr>
         <w:ind w:left="480" w:hanging="480"/>
+        <w:spacing w:after="80" w:line="276" w:lineRule="auto"/>
         <w:jc w:val="left"/>
-        <w:spacing w:after="80" w:line="276" w:lineRule="auto"/>
       </w:pPr>
       <w:r>
         <w:rPr>
           <w:sz w:val="22"/>
           <w:szCs w:val="22"/>
         </w:rPr>
-        <w:t xml:space="preserve">Meyer, J. W., &amp; Rowan, B. (1977). Institutionalized organizations: Formal structure as myth and ceremony. American Journal of Sociology, 83(2), 340-363. https://doi.org/10.1086/226550</w:t>
+        <w:t xml:space="preserve">Meyer, J. W., &amp; Rowan, B. (1977). Institutionalized organizations: Formal structure as myth and ceremony. American Journal of Sociology, 83(2), 340-363. </w:t>
       </w:r>
+      <w:hyperlink r:id="rId157" w:history="1">
+        <w:r>
+          <w:rPr>
+            <w:rStyle w:val="Hyperlink"/>
+            <w:rFonts w:ascii="Times New Roman" w:hAnsi="Times New Roman"/>
+            <w:color w:val="0563C1"/>
+            <w:u w:val="single"/>
+            <w:sz w:val="22"/>
+            <w:szCs w:val="22"/>
+          </w:rPr>
+          <w:t xml:space="preserve">https://doi.org/10.1086/226550</w:t>
+        </w:r>
+      </w:hyperlink>
     </w:p>
     <w:p>
       <w:pPr>
         <w:ind w:left="480" w:hanging="480"/>
+        <w:spacing w:after="80" w:line="276" w:lineRule="auto"/>
         <w:jc w:val="left"/>
-        <w:spacing w:after="80" w:line="276" w:lineRule="auto"/>
       </w:pPr>
       <w:r>
         <w:rPr>
           <w:sz w:val="22"/>
           <w:szCs w:val="22"/>
         </w:rPr>
-        <w:t xml:space="preserve">Min, B. S. (2016). Legal origins, corporate governance, and environmental outcomes. Journal of Business Ethics, 138(3), 507-524. https://doi.org/10.1007/s10551-015-2617-1</w:t>
+        <w:t xml:space="preserve">Min, B. S. (2016). Legal origins, corporate governance, and environmental outcomes. Journal of Business Ethics, 138(3), 507-524. </w:t>
       </w:r>
+      <w:hyperlink r:id="rId158" w:history="1">
+        <w:r>
+          <w:rPr>
+            <w:rStyle w:val="Hyperlink"/>
+            <w:rFonts w:ascii="Times New Roman" w:hAnsi="Times New Roman"/>
+            <w:color w:val="0563C1"/>
+            <w:u w:val="single"/>
+            <w:sz w:val="22"/>
+            <w:szCs w:val="22"/>
+          </w:rPr>
+          <w:t xml:space="preserve">https://doi.org/10.1007/s10551-015-2617-1</w:t>
+        </w:r>
+      </w:hyperlink>
     </w:p>
     <w:p>
       <w:pPr>
         <w:ind w:left="480" w:hanging="480"/>
+        <w:spacing w:after="80" w:line="276" w:lineRule="auto"/>
         <w:jc w:val="left"/>
-        <w:spacing w:after="80" w:line="276" w:lineRule="auto"/>
       </w:pPr>
       <w:r>
         <w:rPr>
           <w:sz w:val="22"/>
           <w:szCs w:val="22"/>
         </w:rPr>
-        <w:t xml:space="preserve">Oliver, C. (1991). Strategic responses to institutional processes. Academy of Management Review, 16(1), 145-179. https://doi.org/10.5465/amr.1991.4279002</w:t>
+        <w:t xml:space="preserve">Oliver, C. (1991). Strategic responses to institutional processes. Academy of Management Review, 16(1), 145-179. </w:t>
       </w:r>
+      <w:hyperlink r:id="rId159" w:history="1">
+        <w:r>
+          <w:rPr>
+            <w:rStyle w:val="Hyperlink"/>
+            <w:rFonts w:ascii="Times New Roman" w:hAnsi="Times New Roman"/>
+            <w:color w:val="0563C1"/>
+            <w:u w:val="single"/>
+            <w:sz w:val="22"/>
+            <w:szCs w:val="22"/>
+          </w:rPr>
+          <w:t xml:space="preserve">https://doi.org/10.5465/amr.1991.4279002</w:t>
+        </w:r>
+      </w:hyperlink>
     </w:p>
     <w:p>
       <w:pPr>
         <w:ind w:left="480" w:hanging="480"/>
+        <w:spacing w:after="80" w:line="276" w:lineRule="auto"/>
         <w:jc w:val="left"/>
-        <w:spacing w:after="80" w:line="276" w:lineRule="auto"/>
       </w:pPr>
       <w:r>
         <w:rPr>
           <w:sz w:val="22"/>
           <w:szCs w:val="22"/>
         </w:rPr>
-        <w:t xml:space="preserve">Park, J. D., Nishitani, K., Kokubu, K., Freedman, M., &amp; Weng, Y. (2023). Revisiting sustainability disclosure theories: Evidence from corporate climate change disclosure in the United States and Japan. Journal of Cleaner Production, 382, 135203. https://doi.org/10.1016/j.jclepro.2022.135203</w:t>
+        <w:t xml:space="preserve">Park, J. D., Nishitani, K., Kokubu, K., Freedman, M., &amp; Weng, Y. (2023). Revisiting sustainability disclosure theories: Evidence from corporate climate change disclosure in the United States and Japan. Journal of Cleaner Production, 382, 135203. </w:t>
       </w:r>
+      <w:hyperlink r:id="rId160" w:history="1">
+        <w:r>
+          <w:rPr>
+            <w:rStyle w:val="Hyperlink"/>
+            <w:rFonts w:ascii="Times New Roman" w:hAnsi="Times New Roman"/>
+            <w:color w:val="0563C1"/>
+            <w:u w:val="single"/>
+            <w:sz w:val="22"/>
+            <w:szCs w:val="22"/>
+          </w:rPr>
+          <w:t xml:space="preserve">https://doi.org/10.1016/j.jclepro.2022.135203</w:t>
+        </w:r>
+      </w:hyperlink>
     </w:p>
     <w:p>
       <w:pPr>
         <w:ind w:left="480" w:hanging="480"/>
+        <w:spacing w:after="80" w:line="276" w:lineRule="auto"/>
         <w:jc w:val="left"/>
-        <w:spacing w:after="80" w:line="276" w:lineRule="auto"/>
       </w:pPr>
       <w:r>
         <w:rPr>
           <w:sz w:val="22"/>
           <w:szCs w:val="22"/>
         </w:rPr>
-        <w:t xml:space="preserve">Patten, D. M. (2002). The relation between environmental performance and environmental disclosure: A research note. Accounting, Organizations and Society, 27(8), 763-773. https://doi.org/10.1016/S0361-3682(02)00028-4</w:t>
+        <w:t xml:space="preserve">Patten, D. M. (2002). The relation between environmental performance and environmental disclosure: A research note. Accounting, Organizations and Society, 27(8), 763-773. </w:t>
       </w:r>
+      <w:hyperlink r:id="rId161" w:history="1">
+        <w:r>
+          <w:rPr>
+            <w:rStyle w:val="Hyperlink"/>
+            <w:rFonts w:ascii="Times New Roman" w:hAnsi="Times New Roman"/>
+            <w:color w:val="0563C1"/>
+            <w:u w:val="single"/>
+            <w:sz w:val="22"/>
+            <w:szCs w:val="22"/>
+          </w:rPr>
+          <w:t xml:space="preserve">https://doi.org/10.1016/S0361-3682(02)00028-4</w:t>
+        </w:r>
+      </w:hyperlink>
     </w:p>
     <w:p>
       <w:pPr>
         <w:ind w:left="480" w:hanging="480"/>
+        <w:spacing w:after="80" w:line="276" w:lineRule="auto"/>
         <w:jc w:val="left"/>
-        <w:spacing w:after="80" w:line="276" w:lineRule="auto"/>
       </w:pPr>
       <w:r>
         <w:rPr>
           <w:sz w:val="22"/>
           <w:szCs w:val="22"/>
         </w:rPr>
-        <w:t xml:space="preserve">Petersen, M. A. (2009). Estimating standard errors in finance panel data sets: Comparing approaches. Review of Financial Studies, 22(1), 435-480. https://doi.org/10.1093/rfs/hhn053</w:t>
+        <w:t xml:space="preserve">Petersen, M. A. (2009). Estimating standard errors in finance panel data sets: Comparing approaches. Review of Financial Studies, 22(1), 435-480. </w:t>
       </w:r>
+      <w:hyperlink r:id="rId162" w:history="1">
+        <w:r>
+          <w:rPr>
+            <w:rStyle w:val="Hyperlink"/>
+            <w:rFonts w:ascii="Times New Roman" w:hAnsi="Times New Roman"/>
+            <w:color w:val="0563C1"/>
+            <w:u w:val="single"/>
+            <w:sz w:val="22"/>
+            <w:szCs w:val="22"/>
+          </w:rPr>
+          <w:t xml:space="preserve">https://doi.org/10.1093/rfs/hhn053</w:t>
+        </w:r>
+      </w:hyperlink>
     </w:p>
     <w:p>
       <w:pPr>
         <w:ind w:left="480" w:hanging="480"/>
+        <w:spacing w:after="80" w:line="276" w:lineRule="auto"/>
         <w:jc w:val="left"/>
-        <w:spacing w:after="80" w:line="276" w:lineRule="auto"/>
       </w:pPr>
       <w:r>
         <w:rPr>
           <w:sz w:val="22"/>
           <w:szCs w:val="22"/>
         </w:rPr>
-        <w:t xml:space="preserve">Porter, M. E., &amp; van der Linde, C. (1995). Toward a new conception of the environment-competitiveness relationship. Journal of Economic Perspectives, 9(4), 97-118. https://doi.org/10.1257/jep.9.4.97</w:t>
+        <w:t xml:space="preserve">Porter, M. E., &amp; van der Linde, C. (1995). Toward a new conception of the environment-competitiveness relationship. Journal of Economic Perspectives, 9(4), 97-118. </w:t>
       </w:r>
+      <w:hyperlink r:id="rId163" w:history="1">
+        <w:r>
+          <w:rPr>
+            <w:rStyle w:val="Hyperlink"/>
+            <w:rFonts w:ascii="Times New Roman" w:hAnsi="Times New Roman"/>
+            <w:color w:val="0563C1"/>
+            <w:u w:val="single"/>
+            <w:sz w:val="22"/>
+            <w:szCs w:val="22"/>
+          </w:rPr>
+          <w:t xml:space="preserve">https://doi.org/10.1257/jep.9.4.97</w:t>
+        </w:r>
+      </w:hyperlink>
     </w:p>
     <w:p>
       <w:pPr>
         <w:ind w:left="480" w:hanging="480"/>
+        <w:spacing w:after="80" w:line="276" w:lineRule="auto"/>
         <w:jc w:val="left"/>
-        <w:spacing w:after="80" w:line="276" w:lineRule="auto"/>
       </w:pPr>
       <w:r>
         <w:rPr>
           <w:sz w:val="22"/>
           <w:szCs w:val="22"/>
         </w:rPr>
-        <w:t xml:space="preserve">Qiu, W., Xuan, Y., Ahmad, M., Sun, S., &amp; Yang, J. (2026). Do sustainability committees mitigate or exacerbate ESG decoupling? Business Strategy and the Environment. Advance online publication. https://doi.org/10.1002/bse.70976</w:t>
+        <w:t xml:space="preserve">Qiu, W., Xuan, Y., Ahmad, M., Sun, S., &amp; Yang, J. (2026). Do sustainability committees mitigate or exacerbate ESG decoupling? Business Strategy and the Environment. Advance online publication. </w:t>
       </w:r>
+      <w:hyperlink r:id="rId164" w:history="1">
+        <w:r>
+          <w:rPr>
+            <w:rStyle w:val="Hyperlink"/>
+            <w:rFonts w:ascii="Times New Roman" w:hAnsi="Times New Roman"/>
+            <w:color w:val="0563C1"/>
+            <w:u w:val="single"/>
+            <w:sz w:val="22"/>
+            <w:szCs w:val="22"/>
+          </w:rPr>
+          <w:t xml:space="preserve">https://doi.org/10.1002/bse.70976</w:t>
+        </w:r>
+      </w:hyperlink>
     </w:p>
     <w:p>
       <w:pPr>
         <w:ind w:left="480" w:hanging="480"/>
+        <w:spacing w:after="80" w:line="276" w:lineRule="auto"/>
         <w:jc w:val="left"/>
-        <w:spacing w:after="80" w:line="276" w:lineRule="auto"/>
       </w:pPr>
       <w:r>
         <w:rPr>
           <w:sz w:val="22"/>
           <w:szCs w:val="22"/>
         </w:rPr>
-        <w:t xml:space="preserve">Rugman, A. M., &amp; Verbeke, A. (1998). Corporate strategies and environmental regulations: An organizing framework. Strategic Management Journal, 19(4), 363-375. https://doi.org/10.1002/(SICI)1097-0266(199804)19:4&lt;363::AID-SMJ974&gt;3.0.CO;2-H</w:t>
+        <w:t xml:space="preserve">Rugman, A. M., &amp; Verbeke, A. (1998). Corporate strategies and environmental regulations: An organizing framework. Strategic Management Journal, 19(4), 363-375. </w:t>
       </w:r>
+      <w:hyperlink r:id="rId165" w:history="1">
+        <w:r>
+          <w:rPr>
+            <w:rStyle w:val="Hyperlink"/>
+            <w:rFonts w:ascii="Times New Roman" w:hAnsi="Times New Roman"/>
+            <w:color w:val="0563C1"/>
+            <w:u w:val="single"/>
+            <w:sz w:val="22"/>
+            <w:szCs w:val="22"/>
+          </w:rPr>
+          <w:t xml:space="preserve">https://doi.org/10.1002/(SICI)1097-0266(199804)19:4&lt;363::AID-SMJ974&gt;3.0.CO;2-H</w:t>
+        </w:r>
+      </w:hyperlink>
     </w:p>
     <w:p>
       <w:pPr>
         <w:ind w:left="480" w:hanging="480"/>
+        <w:spacing w:after="80" w:line="276" w:lineRule="auto"/>
         <w:jc w:val="left"/>
-        <w:spacing w:after="80" w:line="276" w:lineRule="auto"/>
       </w:pPr>
       <w:r>
         <w:rPr>
           <w:sz w:val="22"/>
           <w:szCs w:val="22"/>
         </w:rPr>
-        <w:t xml:space="preserve">Ryu, H., Chae, S., &amp; Song, B. (2017). Corporate environmental responsibility: A legal origins perspective. Journal of Business Ethics, 140(3), 381-402. https://doi.org/10.1007/s10551-015-2641-1</w:t>
+        <w:t xml:space="preserve">Ryu, H., Chae, S., &amp; Song, B. (2017). Corporate environmental responsibility: A legal origins perspective. Journal of Business Ethics, 140(3), 381-402. </w:t>
       </w:r>
+      <w:hyperlink r:id="rId166" w:history="1">
+        <w:r>
+          <w:rPr>
+            <w:rStyle w:val="Hyperlink"/>
+            <w:rFonts w:ascii="Times New Roman" w:hAnsi="Times New Roman"/>
+            <w:color w:val="0563C1"/>
+            <w:u w:val="single"/>
+            <w:sz w:val="22"/>
+            <w:szCs w:val="22"/>
+          </w:rPr>
+          <w:t xml:space="preserve">https://doi.org/10.1007/s10551-015-2641-1</w:t>
+        </w:r>
+      </w:hyperlink>
     </w:p>
     <w:p>
       <w:pPr>
         <w:ind w:left="480" w:hanging="480"/>
+        <w:spacing w:after="80" w:line="276" w:lineRule="auto"/>
         <w:jc w:val="left"/>
-        <w:spacing w:after="80" w:line="276" w:lineRule="auto"/>
       </w:pPr>
       <w:r>
         <w:rPr>
@@ -23705,156 +24576,299 @@
     <w:p>
       <w:pPr>
         <w:ind w:left="480" w:hanging="480"/>
+        <w:spacing w:after="80" w:line="276" w:lineRule="auto"/>
         <w:jc w:val="left"/>
-        <w:spacing w:after="80" w:line="276" w:lineRule="auto"/>
       </w:pPr>
       <w:r>
         <w:rPr>
           <w:sz w:val="22"/>
           <w:szCs w:val="22"/>
         </w:rPr>
-        <w:t xml:space="preserve">Seele, P., &amp; Gatti, L. (2017). Greenwashing revisited: In search of a typology and accusation-based definition incorporating legitimacy strategies. Business Strategy and the Environment, 26(2), 239-252. https://doi.org/10.1002/bse.1912</w:t>
+        <w:t xml:space="preserve">Seele, P., &amp; Gatti, L. (2017). Greenwashing revisited: In search of a typology and accusation-based definition incorporating legitimacy strategies. Business Strategy and the Environment, 26(2), 239-252. </w:t>
       </w:r>
+      <w:hyperlink r:id="rId167" w:history="1">
+        <w:r>
+          <w:rPr>
+            <w:rStyle w:val="Hyperlink"/>
+            <w:rFonts w:ascii="Times New Roman" w:hAnsi="Times New Roman"/>
+            <w:color w:val="0563C1"/>
+            <w:u w:val="single"/>
+            <w:sz w:val="22"/>
+            <w:szCs w:val="22"/>
+          </w:rPr>
+          <w:t xml:space="preserve">https://doi.org/10.1002/bse.1912</w:t>
+        </w:r>
+      </w:hyperlink>
     </w:p>
     <w:p>
       <w:pPr>
         <w:ind w:left="480" w:hanging="480"/>
+        <w:spacing w:after="80" w:line="276" w:lineRule="auto"/>
         <w:jc w:val="left"/>
-        <w:spacing w:after="80" w:line="276" w:lineRule="auto"/>
       </w:pPr>
       <w:r>
         <w:rPr>
           <w:sz w:val="22"/>
           <w:szCs w:val="22"/>
         </w:rPr>
-        <w:t xml:space="preserve">Shuang, Q., Lu, J., Wang, S., Callari, D., &amp; Cucari, N. (2024). Exploring the power of informal institutions: How does social trust affect corporate’s greenwashing strategy. Business Strategy and the Environment, 33(8), 9098-9115. https://doi.org/10.1002/bse.3964</w:t>
+        <w:t xml:space="preserve">Shuang, Q., Lu, J., Wang, S., Callari, D., &amp; Cucari, N. (2024). Exploring the power of informal institutions: How does social trust affect corporate’s greenwashing strategy. Business Strategy and the Environment, 33(8), 9098-9115. </w:t>
       </w:r>
+      <w:hyperlink r:id="rId168" w:history="1">
+        <w:r>
+          <w:rPr>
+            <w:rStyle w:val="Hyperlink"/>
+            <w:rFonts w:ascii="Times New Roman" w:hAnsi="Times New Roman"/>
+            <w:color w:val="0563C1"/>
+            <w:u w:val="single"/>
+            <w:sz w:val="22"/>
+            <w:szCs w:val="22"/>
+          </w:rPr>
+          <w:t xml:space="preserve">https://doi.org/10.1002/bse.3964</w:t>
+        </w:r>
+      </w:hyperlink>
     </w:p>
     <w:p>
       <w:pPr>
         <w:ind w:left="480" w:hanging="480"/>
+        <w:spacing w:after="80" w:line="276" w:lineRule="auto"/>
         <w:jc w:val="left"/>
-        <w:spacing w:after="80" w:line="276" w:lineRule="auto"/>
       </w:pPr>
       <w:r>
         <w:rPr>
           <w:sz w:val="22"/>
           <w:szCs w:val="22"/>
         </w:rPr>
-        <w:t xml:space="preserve">Suchman, M. C. (1995). Managing legitimacy: Strategic and institutional approaches. Academy of Management Review, 20(3), 571-610. https://doi.org/10.5465/amr.1995.9508080331</w:t>
+        <w:t xml:space="preserve">Suchman, M. C. (1995). Managing legitimacy: Strategic and institutional approaches. Academy of Management Review, 20(3), 571-610. </w:t>
       </w:r>
+      <w:hyperlink r:id="rId169" w:history="1">
+        <w:r>
+          <w:rPr>
+            <w:rStyle w:val="Hyperlink"/>
+            <w:rFonts w:ascii="Times New Roman" w:hAnsi="Times New Roman"/>
+            <w:color w:val="0563C1"/>
+            <w:u w:val="single"/>
+            <w:sz w:val="22"/>
+            <w:szCs w:val="22"/>
+          </w:rPr>
+          <w:t xml:space="preserve">https://doi.org/10.5465/amr.1995.9508080331</w:t>
+        </w:r>
+      </w:hyperlink>
     </w:p>
     <w:p>
       <w:pPr>
         <w:ind w:left="480" w:hanging="480"/>
+        <w:spacing w:after="80" w:line="276" w:lineRule="auto"/>
         <w:jc w:val="left"/>
-        <w:spacing w:after="80" w:line="276" w:lineRule="auto"/>
       </w:pPr>
       <w:r>
         <w:rPr>
           <w:sz w:val="22"/>
           <w:szCs w:val="22"/>
         </w:rPr>
-        <w:t xml:space="preserve">Tashman, P., Marano, V., &amp; Kostova, T. (2019). Walking the walk or talking the talk? MNEs and the decoupling of corporate social responsibility. Journal of International Business Studies, 50, 153-171. https://doi.org/10.1057/s41267-018-0171-7</w:t>
+        <w:t xml:space="preserve">Tashman, P., Marano, V., &amp; Kostova, T. (2019). Walking the walk or talking the talk? MNEs and the decoupling of corporate social responsibility. Journal of International Business Studies, 50, 153-171. </w:t>
       </w:r>
+      <w:hyperlink r:id="rId170" w:history="1">
+        <w:r>
+          <w:rPr>
+            <w:rStyle w:val="Hyperlink"/>
+            <w:rFonts w:ascii="Times New Roman" w:hAnsi="Times New Roman"/>
+            <w:color w:val="0563C1"/>
+            <w:u w:val="single"/>
+            <w:sz w:val="22"/>
+            <w:szCs w:val="22"/>
+          </w:rPr>
+          <w:t xml:space="preserve">https://doi.org/10.1057/s41267-018-0171-7</w:t>
+        </w:r>
+      </w:hyperlink>
     </w:p>
     <w:p>
       <w:pPr>
         <w:ind w:left="480" w:hanging="480"/>
+        <w:spacing w:after="80" w:line="276" w:lineRule="auto"/>
         <w:jc w:val="left"/>
-        <w:spacing w:after="80" w:line="276" w:lineRule="auto"/>
       </w:pPr>
       <w:r>
         <w:rPr>
           <w:sz w:val="22"/>
           <w:szCs w:val="22"/>
         </w:rPr>
-        <w:t xml:space="preserve">Transnational Environmental Law. (2019). Collective obligation and individual ambition in the Paris Agreement. Transnational Environmental Law. [authors to be completed] https://doi.org/10.1017/S2047102519000281</w:t>
+        <w:t xml:space="preserve">Transnational Environmental Law. (2019). Collective obligation and individual ambition in the Paris Agreement. Transnational Environmental Law. [authors to be completed] </w:t>
       </w:r>
+      <w:hyperlink r:id="rId171" w:history="1">
+        <w:r>
+          <w:rPr>
+            <w:rStyle w:val="Hyperlink"/>
+            <w:rFonts w:ascii="Times New Roman" w:hAnsi="Times New Roman"/>
+            <w:color w:val="0563C1"/>
+            <w:u w:val="single"/>
+            <w:sz w:val="22"/>
+            <w:szCs w:val="22"/>
+          </w:rPr>
+          <w:t xml:space="preserve">https://doi.org/10.1017/S2047102519000281</w:t>
+        </w:r>
+      </w:hyperlink>
     </w:p>
     <w:p>
       <w:pPr>
         <w:ind w:left="480" w:hanging="480"/>
+        <w:spacing w:after="80" w:line="276" w:lineRule="auto"/>
         <w:jc w:val="left"/>
-        <w:spacing w:after="80" w:line="276" w:lineRule="auto"/>
       </w:pPr>
       <w:r>
         <w:rPr>
           <w:sz w:val="22"/>
           <w:szCs w:val="22"/>
         </w:rPr>
-        <w:t xml:space="preserve">Voigt, C. (2023). The power of the Paris Agreement in international climate litigation. Review of European, Comparative &amp; International Environmental Law, 32(2), 237-249. https://doi.org/10.1111/reel.12514</w:t>
+        <w:t xml:space="preserve">Voigt, C. (2023). The power of the Paris Agreement in international climate litigation. Review of European, Comparative &amp; International Environmental Law, 32(2), 237-249. </w:t>
       </w:r>
+      <w:hyperlink r:id="rId172" w:history="1">
+        <w:r>
+          <w:rPr>
+            <w:rStyle w:val="Hyperlink"/>
+            <w:rFonts w:ascii="Times New Roman" w:hAnsi="Times New Roman"/>
+            <w:color w:val="0563C1"/>
+            <w:u w:val="single"/>
+            <w:sz w:val="22"/>
+            <w:szCs w:val="22"/>
+          </w:rPr>
+          <w:t xml:space="preserve">https://doi.org/10.1111/reel.12514</w:t>
+        </w:r>
+      </w:hyperlink>
     </w:p>
     <w:p>
       <w:pPr>
         <w:ind w:left="480" w:hanging="480"/>
+        <w:spacing w:after="80" w:line="276" w:lineRule="auto"/>
         <w:jc w:val="left"/>
-        <w:spacing w:after="80" w:line="276" w:lineRule="auto"/>
       </w:pPr>
       <w:r>
         <w:rPr>
           <w:sz w:val="22"/>
           <w:szCs w:val="22"/>
         </w:rPr>
-        <w:t xml:space="preserve">Yadav, A., Singh, P., &amp; Kumar, S. (2026). Unveiling the dynamics of green innovation on ESG performance: The role of financial distress and the impact of the Paris Agreement. Thunderbird International Business Review. Advance online publication. https://doi.org/10.1002/tie.70042</w:t>
+        <w:t xml:space="preserve">Yadav, A., Singh, P., &amp; Kumar, S. (2026). Unveiling the dynamics of green innovation on ESG performance: The role of financial distress and the impact of the Paris Agreement. Thunderbird International Business Review. Advance online publication. </w:t>
       </w:r>
+      <w:hyperlink r:id="rId173" w:history="1">
+        <w:r>
+          <w:rPr>
+            <w:rStyle w:val="Hyperlink"/>
+            <w:rFonts w:ascii="Times New Roman" w:hAnsi="Times New Roman"/>
+            <w:color w:val="0563C1"/>
+            <w:u w:val="single"/>
+            <w:sz w:val="22"/>
+            <w:szCs w:val="22"/>
+          </w:rPr>
+          <w:t xml:space="preserve">https://doi.org/10.1002/tie.70042</w:t>
+        </w:r>
+      </w:hyperlink>
     </w:p>
     <w:p>
       <w:pPr>
         <w:ind w:left="480" w:hanging="480"/>
+        <w:spacing w:after="80" w:line="276" w:lineRule="auto"/>
         <w:jc w:val="left"/>
-        <w:spacing w:after="80" w:line="276" w:lineRule="auto"/>
       </w:pPr>
       <w:r>
         <w:rPr>
           <w:sz w:val="22"/>
           <w:szCs w:val="22"/>
         </w:rPr>
-        <w:t xml:space="preserve">Yang, C., Zhu, C., &amp; Albitar, K. (2024). ESG ratings and green innovation: A U-shaped journey towards sustainable development. Business Strategy and the Environment, 33(5), 4108-4129. https://doi.org/10.1002/bse.3692</w:t>
+        <w:t xml:space="preserve">Yang, C., Zhu, C., &amp; Albitar, K. (2024). ESG ratings and green innovation: A U-shaped journey towards sustainable development. Business Strategy and the Environment, 33(5), 4108-4129. </w:t>
       </w:r>
+      <w:hyperlink r:id="rId174" w:history="1">
+        <w:r>
+          <w:rPr>
+            <w:rStyle w:val="Hyperlink"/>
+            <w:rFonts w:ascii="Times New Roman" w:hAnsi="Times New Roman"/>
+            <w:color w:val="0563C1"/>
+            <w:u w:val="single"/>
+            <w:sz w:val="22"/>
+            <w:szCs w:val="22"/>
+          </w:rPr>
+          <w:t xml:space="preserve">https://doi.org/10.1002/bse.3692</w:t>
+        </w:r>
+      </w:hyperlink>
     </w:p>
     <w:p>
       <w:pPr>
         <w:ind w:left="480" w:hanging="480"/>
+        <w:spacing w:after="80" w:line="276" w:lineRule="auto"/>
         <w:jc w:val="left"/>
-        <w:spacing w:after="80" w:line="276" w:lineRule="auto"/>
       </w:pPr>
       <w:r>
         <w:rPr>
           <w:sz w:val="22"/>
           <w:szCs w:val="22"/>
         </w:rPr>
-        <w:t xml:space="preserve">Yu, E. P. Y., Luu, B. V., &amp; Chen, C. H. (2020). Greenwashing in environmental, social and governance disclosures. Research in International Business and Finance, 52, 101192. https://doi.org/10.1016/j.ribaf.2020.101192</w:t>
+        <w:t xml:space="preserve">Yu, E. P. Y., Luu, B. V., &amp; Chen, C. H. (2020). Greenwashing in environmental, social and governance disclosures. Research in International Business and Finance, 52, 101192. </w:t>
       </w:r>
+      <w:hyperlink r:id="rId175" w:history="1">
+        <w:r>
+          <w:rPr>
+            <w:rStyle w:val="Hyperlink"/>
+            <w:rFonts w:ascii="Times New Roman" w:hAnsi="Times New Roman"/>
+            <w:color w:val="0563C1"/>
+            <w:u w:val="single"/>
+            <w:sz w:val="22"/>
+            <w:szCs w:val="22"/>
+          </w:rPr>
+          <w:t xml:space="preserve">https://doi.org/10.1016/j.ribaf.2020.101192</w:t>
+        </w:r>
+      </w:hyperlink>
     </w:p>
     <w:p>
       <w:pPr>
         <w:ind w:left="480" w:hanging="480"/>
+        <w:spacing w:after="80" w:line="276" w:lineRule="auto"/>
         <w:jc w:val="left"/>
-        <w:spacing w:after="80" w:line="276" w:lineRule="auto"/>
       </w:pPr>
       <w:r>
         <w:rPr>
           <w:sz w:val="22"/>
           <w:szCs w:val="22"/>
         </w:rPr>
-        <w:t xml:space="preserve">Yue, J., &amp; Li, Y. (2023). Media attention and corporate greenwashing behavior: Evidence from China. Finance Research Letters, 55, 104016. https://doi.org/10.1016/j.frl.2023.104016</w:t>
+        <w:t xml:space="preserve">Yue, J., &amp; Li, Y. (2023). Media attention and corporate greenwashing behavior: Evidence from China. Finance Research Letters, 55, 104016. </w:t>
       </w:r>
+      <w:hyperlink r:id="rId176" w:history="1">
+        <w:r>
+          <w:rPr>
+            <w:rStyle w:val="Hyperlink"/>
+            <w:rFonts w:ascii="Times New Roman" w:hAnsi="Times New Roman"/>
+            <w:color w:val="0563C1"/>
+            <w:u w:val="single"/>
+            <w:sz w:val="22"/>
+            <w:szCs w:val="22"/>
+          </w:rPr>
+          <w:t xml:space="preserve">https://doi.org/10.1016/j.frl.2023.104016</w:t>
+        </w:r>
+      </w:hyperlink>
     </w:p>
     <w:p>
       <w:pPr>
         <w:ind w:left="480" w:hanging="480"/>
+        <w:spacing w:after="80" w:line="276" w:lineRule="auto"/>
         <w:jc w:val="left"/>
-        <w:spacing w:after="80" w:line="276" w:lineRule="auto"/>
       </w:pPr>
       <w:r>
         <w:rPr>
           <w:sz w:val="22"/>
           <w:szCs w:val="22"/>
         </w:rPr>
-        <w:t xml:space="preserve">Zhao, Y. N., &amp; Lee, C. C. (2024). The impact of vertical environmental regulation mechanism on greenwashing. Journal of Cleaner Production, 475, 143637. https://doi.org/10.1016/j.jclepro.2024.143637</w:t>
+        <w:t xml:space="preserve">Zhao, Y. N., &amp; Lee, C. C. (2024). The impact of vertical environmental regulation mechanism on greenwashing. Journal of Cleaner Production, 475, 143637. </w:t>
       </w:r>
+      <w:hyperlink r:id="rId177" w:history="1">
+        <w:r>
+          <w:rPr>
+            <w:rStyle w:val="Hyperlink"/>
+            <w:rFonts w:ascii="Times New Roman" w:hAnsi="Times New Roman"/>
+            <w:color w:val="0563C1"/>
+            <w:u w:val="single"/>
+            <w:sz w:val="22"/>
+            <w:szCs w:val="22"/>
+          </w:rPr>
+          <w:t xml:space="preserve">https://doi.org/10.1016/j.jclepro.2024.143637</w:t>
+        </w:r>
+      </w:hyperlink>
     </w:p>
     <w:p>
       <w:pPr>
@@ -24129,5 +25143,12 @@
       </w:tblBorders>
     </w:tblPr>
   </w:style>
+  <w:style w:type="character" w:styleId="Hyperlink">
+    <w:name w:val="Hyperlink"/>
+    <w:rPr>
+      <w:color w:val="0563C1"/>
+      <w:u w:val="single"/>
+    </w:rPr>
+  </w:style>
 </w:styles>
 </file>
</xml_diff>